<commit_message>
Add explanation rubric, grading sheets and report updates
Fixed 1-5 rubric (features, support, plausible), one sheet per human
grader over a seeded 60-item sample, and weighted-kappa agreement. A
Qwen2.5-1.5B judge was piloted and rejected: it scored three wrong answers
5/5/5 and took ~160 s per item. Report gains the new metrics and stays at
12 pages.
</commit_message>
<xml_diff>
--- a/report/report.docx
+++ b/report/report.docx
@@ -1509,6 +1509,38 @@
         </w:tc>
       </w:tr>
     </w:tbl>
+    <w:p>
+      <w:pPr>
+        <w:pStyle w:val="BodyText"/>
+      </w:pPr>
+      <w:r>
+        <w:t xml:space="preserve">Beside these accuracies we report the per-kind metrics the brief asks for (Section 5.2): precision,</w:t>
+      </w:r>
+      <w:r>
+        <w:t xml:space="preserve"> </w:t>
+      </w:r>
+      <w:r>
+        <w:t xml:space="preserve">recall, F1 and specificity for yes/no answers; macro-F1 and balanced accuracy for categorical</w:t>
+      </w:r>
+      <w:r>
+        <w:t xml:space="preserve"> </w:t>
+      </w:r>
+      <w:r>
+        <w:t xml:space="preserve">answers; mean and median absolute error for durations and counts; and grounding precision, the</w:t>
+      </w:r>
+      <w:r>
+        <w:t xml:space="preserve"> </w:t>
+      </w:r>
+      <w:r>
+        <w:t xml:space="preserve">share of cited time that the ground-truth labels confirm. Explanations are graded separately with a</w:t>
+      </w:r>
+      <w:r>
+        <w:t xml:space="preserve"> </w:t>
+      </w:r>
+      <w:r>
+        <w:t xml:space="preserve">fixed 1–5 rubric (Section 5.7).</w:t>
+      </w:r>
+    </w:p>
     <w:bookmarkEnd w:id="13"/>
     <w:bookmarkEnd w:id="14"/>
     <w:bookmarkStart w:id="28" w:name="system-design"/>
@@ -3440,6 +3472,59 @@
               <w:pStyle w:val="Compact"/>
             </w:pPr>
             <w:r>
+              <w:t xml:space="preserve">Explanation rubric</w:t>
+            </w:r>
+          </w:p>
+        </w:tc>
+        <w:tc>
+          <w:tcPr/>
+          <w:p>
+            <w:pPr>
+              <w:pStyle w:val="Compact"/>
+            </w:pPr>
+            <w:r>
+              <w:rPr>
+                <w:rStyle w:val="VerbatimChar"/>
+              </w:rPr>
+              <w:t xml:space="preserve">scripts/grade_explanations.py sheet</w:t>
+            </w:r>
+            <w:r>
+              <w:t xml:space="preserve"> </w:t>
+            </w:r>
+            <w:r>
+              <w:t xml:space="preserve">/</w:t>
+            </w:r>
+            <w:r>
+              <w:t xml:space="preserve"> </w:t>
+            </w:r>
+            <w:r>
+              <w:rPr>
+                <w:rStyle w:val="VerbatimChar"/>
+              </w:rPr>
+              <w:t xml:space="preserve">agree</w:t>
+            </w:r>
+          </w:p>
+        </w:tc>
+        <w:tc>
+          <w:tcPr/>
+          <w:p>
+            <w:pPr>
+              <w:pStyle w:val="Compact"/>
+            </w:pPr>
+            <w:r>
+              <w:t xml:space="preserve">grading sheets, agreement</w:t>
+            </w:r>
+          </w:p>
+        </w:tc>
+      </w:tr>
+      <w:tr>
+        <w:tc>
+          <w:tcPr/>
+          <w:p>
+            <w:pPr>
+              <w:pStyle w:val="Compact"/>
+            </w:pPr>
+            <w:r>
               <w:t xml:space="preserve">Answer questions</w:t>
             </w:r>
           </w:p>
@@ -3515,7 +3600,7 @@
         <w:t xml:space="preserve"> </w:t>
       </w:r>
       <w:r>
-        <w:t xml:space="preserve">fixed random states. A test suite of 24 checks (</w:t>
+        <w:t xml:space="preserve">fixed random states. A test suite of 25 checks (</w:t>
       </w:r>
       <w:r>
         <w:rPr>
@@ -3546,7 +3631,7 @@
       </w:r>
     </w:p>
     <w:bookmarkEnd w:id="29"/>
-    <w:bookmarkStart w:id="48" w:name="results"/>
+    <w:bookmarkStart w:id="49" w:name="results"/>
     <w:p>
       <w:pPr>
         <w:pStyle w:val="Heading1"/>
@@ -4172,7 +4257,7 @@
       <w:r>
         <w:drawing>
           <wp:inline>
-            <wp:extent cx="5334000" cy="2400300"/>
+            <wp:extent cx="4693920" cy="2112264"/>
             <wp:effectExtent b="0" l="0" r="0" t="0"/>
             <wp:docPr descr="Figure 1. QA accuracy by question type on 767 questions over 40 held-out recordings, with the correctness rule under each type. Blue: answer correct; orange: answer correct and evidence grounded." title="" id="35" name="Picture"/>
             <a:graphic>
@@ -4193,7 +4278,7 @@
                   <pic:spPr bwMode="auto">
                     <a:xfrm>
                       <a:off x="0" y="0"/>
-                      <a:ext cx="5334000" cy="2400300"/>
+                      <a:ext cx="4693920" cy="2112264"/>
                     </a:xfrm>
                     <a:prstGeom prst="rect">
                       <a:avLst/>
@@ -5013,6 +5098,464 @@
         <w:t xml:space="preserve">classifier at all.</w:t>
       </w:r>
     </w:p>
+    <w:p>
+      <w:pPr>
+        <w:pStyle w:val="TableCaption"/>
+      </w:pPr>
+      <w:r>
+        <w:t xml:space="preserve">Answer-level metrics beside plain accuracy (same 767 questions).</w:t>
+      </w:r>
+    </w:p>
+    <w:tbl>
+      <w:tblPr>
+        <w:tblStyle w:val="Table"/>
+        <w:tblW w:type="pct" w:w="5000"/>
+        <w:tblLayout w:type="fixed"/>
+        <w:tblLook w:firstRow="1" w:lastRow="0" w:firstColumn="0" w:lastColumn="0" w:noHBand="0" w:noVBand="0" w:val="0020"/>
+        <w:tblCaption w:val="Answer-level metrics beside plain accuracy (same 767 questions)."/>
+      </w:tblPr>
+      <w:tblGrid>
+        <w:gridCol w:w="2640"/>
+        <w:gridCol w:w="2640"/>
+        <w:gridCol w:w="2640"/>
+      </w:tblGrid>
+      <w:tr>
+        <w:trPr>
+          <w:tblHeader w:val="on"/>
+        </w:trPr>
+        <w:tc>
+          <w:tcPr/>
+          <w:p>
+            <w:pPr>
+              <w:pStyle w:val="Compact"/>
+            </w:pPr>
+            <w:r>
+              <w:t xml:space="preserve">Answer kind</w:t>
+            </w:r>
+          </w:p>
+        </w:tc>
+        <w:tc>
+          <w:tcPr/>
+          <w:p>
+            <w:pPr>
+              <w:pStyle w:val="Compact"/>
+            </w:pPr>
+            <w:r>
+              <w:t xml:space="preserve">Metric</w:t>
+            </w:r>
+          </w:p>
+        </w:tc>
+        <w:tc>
+          <w:tcPr/>
+          <w:p>
+            <w:pPr>
+              <w:pStyle w:val="Compact"/>
+            </w:pPr>
+            <w:r>
+              <w:t xml:space="preserve">Value</w:t>
+            </w:r>
+          </w:p>
+        </w:tc>
+      </w:tr>
+      <w:tr>
+        <w:tc>
+          <w:tcPr/>
+          <w:p>
+            <w:pPr>
+              <w:pStyle w:val="Compact"/>
+            </w:pPr>
+            <w:r>
+              <w:t xml:space="preserve">Verification (yes/no, n = 150)</w:t>
+            </w:r>
+          </w:p>
+        </w:tc>
+        <w:tc>
+          <w:tcPr/>
+          <w:p>
+            <w:pPr>
+              <w:pStyle w:val="Compact"/>
+            </w:pPr>
+            <w:r>
+              <w:t xml:space="preserve">precision / recall / F1 on</w:t>
+            </w:r>
+            <w:r>
+              <w:t xml:space="preserve"> </w:t>
+            </w:r>
+            <w:r>
+              <w:t xml:space="preserve">“yes”</w:t>
+            </w:r>
+            <w:r>
+              <w:t xml:space="preserve">; specificity</w:t>
+            </w:r>
+          </w:p>
+        </w:tc>
+        <w:tc>
+          <w:tcPr/>
+          <w:p>
+            <w:pPr>
+              <w:pStyle w:val="Compact"/>
+            </w:pPr>
+            <w:r>
+              <w:t xml:space="preserve">0.88 / 0.60 / 0.71; 0.92</w:t>
+            </w:r>
+          </w:p>
+        </w:tc>
+      </w:tr>
+      <w:tr>
+        <w:tc>
+          <w:tcPr/>
+          <w:p>
+            <w:pPr>
+              <w:pStyle w:val="Compact"/>
+            </w:pPr>
+            <w:r>
+              <w:t xml:space="preserve">Prolonged (yes/no, n = 80)</w:t>
+            </w:r>
+          </w:p>
+        </w:tc>
+        <w:tc>
+          <w:tcPr/>
+          <w:p>
+            <w:pPr>
+              <w:pStyle w:val="Compact"/>
+            </w:pPr>
+            <w:r>
+              <w:t xml:space="preserve">precision / recall / F1 on</w:t>
+            </w:r>
+            <w:r>
+              <w:t xml:space="preserve"> </w:t>
+            </w:r>
+            <w:r>
+              <w:t xml:space="preserve">“yes”</w:t>
+            </w:r>
+            <w:r>
+              <w:t xml:space="preserve">; specificity</w:t>
+            </w:r>
+          </w:p>
+        </w:tc>
+        <w:tc>
+          <w:tcPr/>
+          <w:p>
+            <w:pPr>
+              <w:pStyle w:val="Compact"/>
+            </w:pPr>
+            <w:r>
+              <w:t xml:space="preserve">0.70 / 0.92 / 0.79; 0.82</w:t>
+            </w:r>
+          </w:p>
+        </w:tc>
+      </w:tr>
+      <w:tr>
+        <w:tc>
+          <w:tcPr/>
+          <w:p>
+            <w:pPr>
+              <w:pStyle w:val="Compact"/>
+            </w:pPr>
+            <w:r>
+              <w:t xml:space="preserve">Onset detected (n = 74, all present)</w:t>
+            </w:r>
+          </w:p>
+        </w:tc>
+        <w:tc>
+          <w:tcPr/>
+          <w:p>
+            <w:pPr>
+              <w:pStyle w:val="Compact"/>
+            </w:pPr>
+            <w:r>
+              <w:t xml:space="preserve">recall (</w:t>
+            </w:r>
+            <w:r>
+              <w:t xml:space="preserve">“yes”</w:t>
+            </w:r>
+            <w:r>
+              <w:t xml:space="preserve"> </w:t>
+            </w:r>
+            <w:r>
+              <w:t xml:space="preserve">when the activity starts)</w:t>
+            </w:r>
+          </w:p>
+        </w:tc>
+        <w:tc>
+          <w:tcPr/>
+          <w:p>
+            <w:pPr>
+              <w:pStyle w:val="Compact"/>
+            </w:pPr>
+            <w:r>
+              <w:t xml:space="preserve">0.82</w:t>
+            </w:r>
+          </w:p>
+        </w:tc>
+      </w:tr>
+      <w:tr>
+        <w:tc>
+          <w:tcPr/>
+          <w:p>
+            <w:pPr>
+              <w:pStyle w:val="Compact"/>
+            </w:pPr>
+            <w:r>
+              <w:t xml:space="preserve">Identification (4 classes, n = 75)</w:t>
+            </w:r>
+          </w:p>
+        </w:tc>
+        <w:tc>
+          <w:tcPr/>
+          <w:p>
+            <w:pPr>
+              <w:pStyle w:val="Compact"/>
+            </w:pPr>
+            <w:r>
+              <w:t xml:space="preserve">macro-F1 / balanced accuracy</w:t>
+            </w:r>
+          </w:p>
+        </w:tc>
+        <w:tc>
+          <w:tcPr/>
+          <w:p>
+            <w:pPr>
+              <w:pStyle w:val="Compact"/>
+            </w:pPr>
+            <w:r>
+              <w:t xml:space="preserve">0.48 / 0.47</w:t>
+            </w:r>
+          </w:p>
+        </w:tc>
+      </w:tr>
+      <w:tr>
+        <w:tc>
+          <w:tcPr/>
+          <w:p>
+            <w:pPr>
+              <w:pStyle w:val="Compact"/>
+            </w:pPr>
+            <w:r>
+              <w:t xml:space="preserve">Comparison (6 winners, n = 80)</w:t>
+            </w:r>
+          </w:p>
+        </w:tc>
+        <w:tc>
+          <w:tcPr/>
+          <w:p>
+            <w:pPr>
+              <w:pStyle w:val="Compact"/>
+            </w:pPr>
+            <w:r>
+              <w:t xml:space="preserve">macro-F1 / balanced accuracy</w:t>
+            </w:r>
+          </w:p>
+        </w:tc>
+        <w:tc>
+          <w:tcPr/>
+          <w:p>
+            <w:pPr>
+              <w:pStyle w:val="Compact"/>
+            </w:pPr>
+            <w:r>
+              <w:t xml:space="preserve">0.85 / 0.83</w:t>
+            </w:r>
+          </w:p>
+        </w:tc>
+      </w:tr>
+      <w:tr>
+        <w:tc>
+          <w:tcPr/>
+          <w:p>
+            <w:pPr>
+              <w:pStyle w:val="Compact"/>
+            </w:pPr>
+            <w:r>
+              <w:t xml:space="preserve">Open-world (3 verdicts, n = 80)</w:t>
+            </w:r>
+          </w:p>
+        </w:tc>
+        <w:tc>
+          <w:tcPr/>
+          <w:p>
+            <w:pPr>
+              <w:pStyle w:val="Compact"/>
+            </w:pPr>
+            <w:r>
+              <w:t xml:space="preserve">macro-F1 / balanced accuracy</w:t>
+            </w:r>
+          </w:p>
+        </w:tc>
+        <w:tc>
+          <w:tcPr/>
+          <w:p>
+            <w:pPr>
+              <w:pStyle w:val="Compact"/>
+            </w:pPr>
+            <w:r>
+              <w:t xml:space="preserve">0.67 / 0.69</w:t>
+            </w:r>
+          </w:p>
+        </w:tc>
+      </w:tr>
+      <w:tr>
+        <w:tc>
+          <w:tcPr/>
+          <w:p>
+            <w:pPr>
+              <w:pStyle w:val="Compact"/>
+            </w:pPr>
+            <w:r>
+              <w:t xml:space="preserve">Duration (n = 114)</w:t>
+            </w:r>
+          </w:p>
+        </w:tc>
+        <w:tc>
+          <w:tcPr/>
+          <w:p>
+            <w:pPr>
+              <w:pStyle w:val="Compact"/>
+            </w:pPr>
+            <w:r>
+              <w:t xml:space="preserve">mean / median absolute error; MAPE (74 non-zero refs)</w:t>
+            </w:r>
+          </w:p>
+        </w:tc>
+        <w:tc>
+          <w:tcPr/>
+          <w:p>
+            <w:pPr>
+              <w:pStyle w:val="Compact"/>
+            </w:pPr>
+            <w:r>
+              <w:t xml:space="preserve">1,056 s / 163 s; 95%</w:t>
+            </w:r>
+          </w:p>
+        </w:tc>
+      </w:tr>
+      <w:tr>
+        <w:tc>
+          <w:tcPr/>
+          <w:p>
+            <w:pPr>
+              <w:pStyle w:val="Compact"/>
+            </w:pPr>
+            <w:r>
+              <w:t xml:space="preserve">Count (n = 114)</w:t>
+            </w:r>
+          </w:p>
+        </w:tc>
+        <w:tc>
+          <w:tcPr/>
+          <w:p>
+            <w:pPr>
+              <w:pStyle w:val="Compact"/>
+            </w:pPr>
+            <w:r>
+              <w:t xml:space="preserve">mean / median absolute error</w:t>
+            </w:r>
+          </w:p>
+        </w:tc>
+        <w:tc>
+          <w:tcPr/>
+          <w:p>
+            <w:pPr>
+              <w:pStyle w:val="Compact"/>
+            </w:pPr>
+            <w:r>
+              <w:t xml:space="preserve">4.9 / 1.0 bouts</w:t>
+            </w:r>
+          </w:p>
+        </w:tc>
+      </w:tr>
+      <w:tr>
+        <w:tc>
+          <w:tcPr/>
+          <w:p>
+            <w:pPr>
+              <w:pStyle w:val="Compact"/>
+            </w:pPr>
+            <w:r>
+              <w:t xml:space="preserve">Cited evidence (duration, onset)</w:t>
+            </w:r>
+          </w:p>
+        </w:tc>
+        <w:tc>
+          <w:tcPr/>
+          <w:p>
+            <w:pPr>
+              <w:pStyle w:val="Compact"/>
+            </w:pPr>
+            <w:r>
+              <w:t xml:space="preserve">grounding precision</w:t>
+            </w:r>
+          </w:p>
+        </w:tc>
+        <w:tc>
+          <w:tcPr/>
+          <w:p>
+            <w:pPr>
+              <w:pStyle w:val="Compact"/>
+            </w:pPr>
+            <w:r>
+              <w:t xml:space="preserve">0.45</w:t>
+            </w:r>
+          </w:p>
+        </w:tc>
+      </w:tr>
+    </w:tbl>
+    <w:p>
+      <w:pPr>
+        <w:pStyle w:val="BodyText"/>
+      </w:pPr>
+      <w:r>
+        <w:t xml:space="preserve">These metrics expose two biases that accuracy hides. Verification leans towards</w:t>
+      </w:r>
+      <w:r>
+        <w:t xml:space="preserve"> </w:t>
+      </w:r>
+      <w:r>
+        <w:t xml:space="preserve">“no”</w:t>
+      </w:r>
+      <w:r>
+        <w:t xml:space="preserve"> </w:t>
+      </w:r>
+      <w:r>
+        <w:t xml:space="preserve">(specificity</w:t>
+      </w:r>
+      <w:r>
+        <w:t xml:space="preserve"> </w:t>
+      </w:r>
+      <w:r>
+        <w:t xml:space="preserve">0.92, recall 0.60): when the asked-about activity is present, the system misses it in 40% of cases,</w:t>
+      </w:r>
+      <w:r>
+        <w:t xml:space="preserve"> </w:t>
+      </w:r>
+      <w:r>
+        <w:t xml:space="preserve">mostly under-recognised postures. Prolonged questions lean the other way (recall 0.92, precision</w:t>
+      </w:r>
+      <w:r>
+        <w:t xml:space="preserve"> </w:t>
+      </w:r>
+      <w:r>
+        <w:t xml:space="preserve">0.70): a long still stretch is sometimes over-merged into one bout. The numeric errors are</w:t>
+      </w:r>
+      <w:r>
+        <w:t xml:space="preserve"> </w:t>
+      </w:r>
+      <w:r>
+        <w:t xml:space="preserve">heavy-tailed: the typical duration error is 163 s and the typical count error one bout, but a few long</w:t>
+      </w:r>
+      <w:r>
+        <w:t xml:space="preserve"> </w:t>
+      </w:r>
+      <w:r>
+        <w:t xml:space="preserve">recordings in which a whole posture is mislabelled (sitting as lying) push the mean to 1,056 s.</w:t>
+      </w:r>
+      <w:r>
+        <w:t xml:space="preserve"> </w:t>
+      </w:r>
+      <w:r>
+        <w:t xml:space="preserve">MAPE is inflated by references of a few minutes, where any error is a large percentage.</w:t>
+      </w:r>
+    </w:p>
     <w:bookmarkEnd w:id="37"/>
     <w:bookmarkStart w:id="41" w:name="accuracy-versus-strictness"/>
     <w:p>
@@ -5030,7 +5573,7 @@
       <w:r>
         <w:drawing>
           <wp:inline>
-            <wp:extent cx="5334000" cy="2133600"/>
+            <wp:extent cx="4267200" cy="1706880"/>
             <wp:effectExtent b="0" l="0" r="0" t="0"/>
             <wp:docPr descr="Figure 3. Left: share of duration answers accepted as the relative-error tolerance grows. Right: share of cited intervals accepted as the IoU threshold grows." title="" id="39" name="Picture"/>
             <a:graphic>
@@ -5051,7 +5594,7 @@
                   <pic:spPr bwMode="auto">
                     <a:xfrm>
                       <a:off x="0" y="0"/>
-                      <a:ext cx="5334000" cy="2133600"/>
+                      <a:ext cx="4267200" cy="1706880"/>
                     </a:xfrm>
                     <a:prstGeom prst="rect">
                       <a:avLst/>
@@ -5133,7 +5676,7 @@
       <w:r>
         <w:drawing>
           <wp:inline>
-            <wp:extent cx="5334000" cy="1689100"/>
+            <wp:extent cx="4533900" cy="1435735"/>
             <wp:effectExtent b="0" l="0" r="0" t="0"/>
             <wp:docPr descr="Figure 5. Overall QA accuracy on a fixed set of 10 recordings as the input is degraded." title="" id="43" name="Picture"/>
             <a:graphic>
@@ -5154,7 +5697,7 @@
                   <pic:spPr bwMode="auto">
                     <a:xfrm>
                       <a:off x="0" y="0"/>
-                      <a:ext cx="5334000" cy="1689100"/>
+                      <a:ext cx="4533900" cy="1435735"/>
                     </a:xfrm>
                     <a:prstGeom prst="rect">
                       <a:avLst/>
@@ -5878,8 +6421,251 @@
       </w:r>
     </w:p>
     <w:bookmarkEnd w:id="47"/>
+    <w:bookmarkStart w:id="48" w:name="explanation-quality"/>
+    <w:p>
+      <w:pPr>
+        <w:pStyle w:val="Heading2"/>
+      </w:pPr>
+      <w:r>
+        <w:t xml:space="preserve">5.7 Explanation quality</w:t>
+      </w:r>
+    </w:p>
+    <w:p>
+      <w:pPr>
+        <w:pStyle w:val="FirstParagraph"/>
+      </w:pPr>
+      <w:r>
+        <w:t xml:space="preserve">The brief asks for explanations to be graded 1–5 on whether they cite real signal features</w:t>
+      </w:r>
+      <w:r>
+        <w:t xml:space="preserve"> </w:t>
+      </w:r>
+      <w:r>
+        <w:t xml:space="preserve">(</w:t>
+      </w:r>
+      <w:r>
+        <w:rPr>
+          <w:i/>
+          <w:iCs/>
+        </w:rPr>
+        <w:t xml:space="preserve">features</w:t>
+      </w:r>
+      <w:r>
+        <w:t xml:space="preserve">), whether those features support the conclusion (</w:t>
+      </w:r>
+      <w:r>
+        <w:rPr>
+          <w:i/>
+          <w:iCs/>
+        </w:rPr>
+        <w:t xml:space="preserve">support</w:t>
+      </w:r>
+      <w:r>
+        <w:t xml:space="preserve">) and whether the conclusion</w:t>
+      </w:r>
+      <w:r>
+        <w:t xml:space="preserve"> </w:t>
+      </w:r>
+      <w:r>
+        <w:t xml:space="preserve">is plausible (</w:t>
+      </w:r>
+      <w:r>
+        <w:rPr>
+          <w:i/>
+          <w:iCs/>
+        </w:rPr>
+        <w:t xml:space="preserve">plausible</w:t>
+      </w:r>
+      <w:r>
+        <w:t xml:space="preserve">). The rubric, with anchors for 1, 3 and 5, is fixed in</w:t>
+      </w:r>
+      <w:r>
+        <w:t xml:space="preserve"> </w:t>
+      </w:r>
+      <w:r>
+        <w:rPr>
+          <w:rStyle w:val="VerbatimChar"/>
+        </w:rPr>
+        <w:t xml:space="preserve">src/ats/eval/rubric.py</w:t>
+      </w:r>
+      <w:r>
+        <w:t xml:space="preserve"> </w:t>
+      </w:r>
+      <w:r>
+        <w:t xml:space="preserve">and shown identically to human and model graders. A seeded, stratified</w:t>
+      </w:r>
+      <w:r>
+        <w:t xml:space="preserve"> </w:t>
+      </w:r>
+      <w:r>
+        <w:t xml:space="preserve">sample of 60 answers (20 each of open-world, prolonged and onset) is exported as one sheet per grader,</w:t>
+      </w:r>
+      <w:r>
+        <w:t xml:space="preserve"> </w:t>
+      </w:r>
+      <w:r>
+        <w:t xml:space="preserve">and</w:t>
+      </w:r>
+      <w:r>
+        <w:t xml:space="preserve"> </w:t>
+      </w:r>
+      <w:r>
+        <w:rPr>
+          <w:rStyle w:val="VerbatimChar"/>
+        </w:rPr>
+        <w:t xml:space="preserve">grade_explanations.py agree</w:t>
+      </w:r>
+      <w:r>
+        <w:t xml:space="preserve"> </w:t>
+      </w:r>
+      <w:r>
+        <w:t xml:space="preserve">reports quadratic-weighted Cohen’s κ and ±1 agreement between them.</w:t>
+      </w:r>
+    </w:p>
+    <w:p>
+      <w:pPr>
+        <w:pStyle w:val="BodyText"/>
+      </w:pPr>
+      <w:r>
+        <w:rPr>
+          <w:b/>
+          <w:bCs/>
+        </w:rPr>
+        <w:t xml:space="preserve">A small language model is not a usable judge here.</w:t>
+      </w:r>
+      <w:r>
+        <w:t xml:space="preserve"> </w:t>
+      </w:r>
+      <w:r>
+        <w:t xml:space="preserve">We piloted Qwen2.5-1.5B-Instruct as the</w:t>
+      </w:r>
+      <w:r>
+        <w:t xml:space="preserve"> </w:t>
+      </w:r>
+      <w:r>
+        <w:t xml:space="preserve">judge (bfloat16, CPU; the Apple GPU backend crashed on this OS). On the 3 pilot items it gave 5/5/5</w:t>
+      </w:r>
+      <w:r>
+        <w:t xml:space="preserve"> </w:t>
+      </w:r>
+      <w:r>
+        <w:t xml:space="preserve">to every answer, although all three answers were wrong, and it took about 160 s per item on the</w:t>
+      </w:r>
+      <w:r>
+        <w:t xml:space="preserve"> </w:t>
+      </w:r>
+      <w:r>
+        <w:t xml:space="preserve">8 GB laptop, so 60 items would take hours and the scores would not discriminate. We therefore do</w:t>
+      </w:r>
+      <w:r>
+        <w:t xml:space="preserve"> </w:t>
+      </w:r>
+      <w:r>
+        <w:t xml:space="preserve">not report LLM-judge scores.</w:t>
+      </w:r>
+      <w:r>
+        <w:t xml:space="preserve"> </w:t>
+      </w:r>
+      <w:r>
+        <w:rPr>
+          <w:b/>
+          <w:bCs/>
+        </w:rPr>
+        <w:t xml:space="preserve">Human grading:</w:t>
+      </w:r>
+      <w:r>
+        <w:t xml:space="preserve"> </w:t>
+      </w:r>
+      <w:r>
+        <w:t xml:space="preserve">[to be completed by the group: mean rubric score per</w:t>
+      </w:r>
+      <w:r>
+        <w:t xml:space="preserve"> </w:t>
+      </w:r>
+      <w:r>
+        <w:t xml:space="preserve">criterion from two graders over the 60 items, and their weighted κ, from</w:t>
+      </w:r>
+      <w:r>
+        <w:t xml:space="preserve"> </w:t>
+      </w:r>
+      <w:r>
+        <w:rPr>
+          <w:rStyle w:val="VerbatimChar"/>
+        </w:rPr>
+        <w:t xml:space="preserve">results/extrasensory/rubric/</w:t>
+      </w:r>
+      <w:r>
+        <w:t xml:space="preserve">.]</w:t>
+      </w:r>
+    </w:p>
+    <w:p>
+      <w:pPr>
+        <w:pStyle w:val="BodyText"/>
+      </w:pPr>
+      <w:r>
+        <w:t xml:space="preserve">By construction, every number an explanation quotes (variability in g, cadence in Hz, rotation in</w:t>
+      </w:r>
+      <w:r>
+        <w:t xml:space="preserve"> </w:t>
+      </w:r>
+      <w:r>
+        <w:t xml:space="preserve">rad/s, tilt in degrees, bout lengths) is computed from the cited windows, so the</w:t>
+      </w:r>
+      <w:r>
+        <w:t xml:space="preserve"> </w:t>
+      </w:r>
+      <w:r>
+        <w:rPr>
+          <w:i/>
+          <w:iCs/>
+        </w:rPr>
+        <w:t xml:space="preserve">features</w:t>
+      </w:r>
+      <w:r>
+        <w:t xml:space="preserve"> </w:t>
+      </w:r>
+      <w:r>
+        <w:t xml:space="preserve">criterion</w:t>
+      </w:r>
+      <w:r>
+        <w:t xml:space="preserve"> </w:t>
+      </w:r>
+      <w:r>
+        <w:t xml:space="preserve">checks presentation rather than truthfulness; the substantive question is</w:t>
+      </w:r>
+      <w:r>
+        <w:t xml:space="preserve"> </w:t>
+      </w:r>
+      <w:r>
+        <w:rPr>
+          <w:i/>
+          <w:iCs/>
+        </w:rPr>
+        <w:t xml:space="preserve">support</w:t>
+      </w:r>
+      <w:r>
+        <w:t xml:space="preserve"> </w:t>
+      </w:r>
+      <w:r>
+        <w:t xml:space="preserve">and</w:t>
+      </w:r>
+      <w:r>
+        <w:t xml:space="preserve"> </w:t>
+      </w:r>
+      <w:r>
+        <w:rPr>
+          <w:i/>
+          <w:iCs/>
+        </w:rPr>
+        <w:t xml:space="preserve">plausible</w:t>
+      </w:r>
+      <w:r>
+        <w:t xml:space="preserve">, which follow the answer’s correctness.</w:t>
+      </w:r>
+    </w:p>
     <w:bookmarkEnd w:id="48"/>
-    <w:bookmarkStart w:id="52" w:name="Xf4f0b1b30f3f81309c2a887ed5fdf69a99e44d3"/>
+    <w:bookmarkEnd w:id="49"/>
+    <w:bookmarkStart w:id="53" w:name="Xf4f0b1b30f3f81309c2a887ed5fdf69a99e44d3"/>
     <w:p>
       <w:pPr>
         <w:pStyle w:val="Heading1"/>
@@ -5955,7 +6741,62 @@
         <w:t xml:space="preserve"> </w:t>
       </w:r>
       <w:r>
-        <w:t xml:space="preserve">median of 7 runs. We also report the classifier’s share.</w:t>
+        <w:t xml:space="preserve">median of 7 runs. We also report the classifier’s share, the number of learned parameters (split</w:t>
+      </w:r>
+      <w:r>
+        <w:t xml:space="preserve"> </w:t>
+      </w:r>
+      <w:r>
+        <w:t xml:space="preserve">thresholds and leaf values for trees; weights, biases and input-scaler statistics for MLPs), and</w:t>
+      </w:r>
+      <w:r>
+        <w:t xml:space="preserve"> </w:t>
+      </w:r>
+      <w:r>
+        <w:t xml:space="preserve">the CPU time per query. CPU utilisation (CPU time / wall time) is 0.98–1.00 for every</w:t>
+      </w:r>
+      <w:r>
+        <w:t xml:space="preserve"> </w:t>
+      </w:r>
+      <w:r>
+        <w:t xml:space="preserve">configuration, i.e. one core fully busy. Energy per query is an</w:t>
+      </w:r>
+      <w:r>
+        <w:t xml:space="preserve"> </w:t>
+      </w:r>
+      <w:r>
+        <w:rPr>
+          <w:b/>
+          <w:bCs/>
+        </w:rPr>
+        <w:t xml:space="preserve">estimate</w:t>
+      </w:r>
+      <w:r>
+        <w:t xml:space="preserve">, CPU time × 4 W</w:t>
+      </w:r>
+      <w:r>
+        <w:t xml:space="preserve"> </w:t>
+      </w:r>
+      <w:r>
+        <w:t xml:space="preserve">(assumed active power of one performance core), because macOS exposes per-process energy only</w:t>
+      </w:r>
+      <w:r>
+        <w:t xml:space="preserve"> </w:t>
+      </w:r>
+      <w:r>
+        <w:t xml:space="preserve">through privileged</w:t>
+      </w:r>
+      <w:r>
+        <w:t xml:space="preserve"> </w:t>
+      </w:r>
+      <w:r>
+        <w:rPr>
+          <w:rStyle w:val="VerbatimChar"/>
+        </w:rPr>
+        <w:t xml:space="preserve">powermetrics</w:t>
+      </w:r>
+      <w:r>
+        <w:t xml:space="preserve">; it scales linearly with that assumption.</w:t>
       </w:r>
       <w:r>
         <w:t xml:space="preserve"> </w:t>
@@ -5971,13 +6812,13 @@
         <w:t xml:space="preserve"> </w:t>
       </w:r>
       <w:r>
-        <w:t xml:space="preserve">is the overall QA accuracy on</w:t>
-      </w:r>
-      <w:r>
-        <w:t xml:space="preserve"> </w:t>
-      </w:r>
-      <w:r>
-        <w:t xml:space="preserve">the same 767 questions, through the full pipeline.</w:t>
+        <w:t xml:space="preserve">is the</w:t>
+      </w:r>
+      <w:r>
+        <w:t xml:space="preserve"> </w:t>
+      </w:r>
+      <w:r>
+        <w:t xml:space="preserve">overall QA accuracy on the same 767 questions, through the full pipeline.</w:t>
       </w:r>
     </w:p>
     <w:p>
@@ -6085,18 +6926,18 @@
           <wp:inline>
             <wp:extent cx="5334000" cy="1631576"/>
             <wp:effectExtent b="0" l="0" r="0" t="0"/>
-            <wp:docPr descr="Figure 4. Accuracy versus model size, classifier time and end-to-end latency. Red: Pareto frontier. Error bars: paired 95% bootstrap interval of the difference to the full model, drawn around each point." title="" id="50" name="Picture"/>
+            <wp:docPr descr="Figure 4. Accuracy versus model size, classifier time and end-to-end latency. Red: Pareto frontier. Error bars: paired 95% bootstrap interval of the difference to the full model, drawn around each point." title="" id="51" name="Picture"/>
             <a:graphic>
               <a:graphicData uri="http://schemas.openxmlformats.org/drawingml/2006/picture">
                 <pic:pic>
                   <pic:nvPicPr>
-                    <pic:cNvPr descr="../results/extrasensory/fig4_accuracy_vs_overhead.png" id="51" name="Picture"/>
+                    <pic:cNvPr descr="../results/extrasensory/fig4_accuracy_vs_overhead.png" id="52" name="Picture"/>
                     <pic:cNvPicPr>
                       <a:picLocks noChangeArrowheads="1" noChangeAspect="1"/>
                     </pic:cNvPicPr>
                   </pic:nvPicPr>
                   <pic:blipFill>
-                    <a:blip r:embed="rId49"/>
+                    <a:blip r:embed="rId50"/>
                     <a:stretch>
                       <a:fillRect/>
                     </a:stretch>
@@ -6136,7 +6977,7 @@
         <w:pStyle w:val="TableCaption"/>
       </w:pPr>
       <w:r>
-        <w:t xml:space="preserve">Efficiency results. Peak working memory is ~20 MB for every configuration (dominated by the recording, not the model).</w:t>
+        <w:t xml:space="preserve">Efficiency results. Peak working memory is ~20 MB for every configuration (dominated by the recording, not the model). Energy: CPU time × 4 W, an estimate (CPU time measured in a separate pass of the same query).</w:t>
       </w:r>
     </w:p>
     <w:tbl>
@@ -6145,15 +6986,17 @@
         <w:tblW w:type="pct" w:w="5000"/>
         <w:tblLayout w:type="fixed"/>
         <w:tblLook w:firstRow="1" w:lastRow="0" w:firstColumn="0" w:lastColumn="0" w:noHBand="0" w:noVBand="0" w:val="0020"/>
-        <w:tblCaption w:val="Efficiency results. Peak working memory is ~20 MB for every configuration (dominated by the recording, not the model)."/>
+        <w:tblCaption w:val="Efficiency results. Peak working memory is ~20 MB for every configuration (dominated by the recording, not the model). Energy: CPU time × 4 W, an estimate (CPU time measured in a separate pass of the same query)."/>
       </w:tblPr>
       <w:tblGrid>
-        <w:gridCol w:w="1080"/>
-        <w:gridCol w:w="1440"/>
-        <w:gridCol w:w="1440"/>
-        <w:gridCol w:w="1440"/>
-        <w:gridCol w:w="1440"/>
-        <w:gridCol w:w="1080"/>
+        <w:gridCol w:w="792"/>
+        <w:gridCol w:w="1056"/>
+        <w:gridCol w:w="1056"/>
+        <w:gridCol w:w="1056"/>
+        <w:gridCol w:w="1056"/>
+        <w:gridCol w:w="1056"/>
+        <w:gridCol w:w="1056"/>
+        <w:gridCol w:w="792"/>
       </w:tblGrid>
       <w:tr>
         <w:trPr>
@@ -6178,6 +7021,18 @@
               <w:jc w:val="right"/>
             </w:pPr>
             <w:r>
+              <w:t xml:space="preserve">Params</w:t>
+            </w:r>
+          </w:p>
+        </w:tc>
+        <w:tc>
+          <w:tcPr/>
+          <w:p>
+            <w:pPr>
+              <w:pStyle w:val="Compact"/>
+              <w:jc w:val="right"/>
+            </w:pPr>
+            <w:r>
               <w:t xml:space="preserve">Size</w:t>
             </w:r>
           </w:p>
@@ -6203,6 +7058,18 @@
             </w:pPr>
             <w:r>
               <w:t xml:space="preserve">Query, 1 h</w:t>
+            </w:r>
+          </w:p>
+        </w:tc>
+        <w:tc>
+          <w:tcPr/>
+          <w:p>
+            <w:pPr>
+              <w:pStyle w:val="Compact"/>
+              <w:jc w:val="right"/>
+            </w:pPr>
+            <w:r>
+              <w:t xml:space="preserve">Energy (est.)</w:t>
             </w:r>
           </w:p>
         </w:tc>
@@ -6250,6 +7117,18 @@
               <w:jc w:val="right"/>
             </w:pPr>
             <w:r>
+              <w:t xml:space="preserve">128,107</w:t>
+            </w:r>
+          </w:p>
+        </w:tc>
+        <w:tc>
+          <w:tcPr/>
+          <w:p>
+            <w:pPr>
+              <w:pStyle w:val="Compact"/>
+              <w:jc w:val="right"/>
+            </w:pPr>
+            <w:r>
               <w:t xml:space="preserve">7.32 MB</w:t>
             </w:r>
           </w:p>
@@ -6275,6 +7154,18 @@
             </w:pPr>
             <w:r>
               <w:t xml:space="preserve">94.0 ms</w:t>
+            </w:r>
+          </w:p>
+        </w:tc>
+        <w:tc>
+          <w:tcPr/>
+          <w:p>
+            <w:pPr>
+              <w:pStyle w:val="Compact"/>
+              <w:jc w:val="right"/>
+            </w:pPr>
+            <w:r>
+              <w:t xml:space="preserve">367 mJ</w:t>
             </w:r>
           </w:p>
         </w:tc>
@@ -6322,6 +7213,18 @@
               <w:jc w:val="right"/>
             </w:pPr>
             <w:r>
+              <w:t xml:space="preserve">42,707</w:t>
+            </w:r>
+          </w:p>
+        </w:tc>
+        <w:tc>
+          <w:tcPr/>
+          <w:p>
+            <w:pPr>
+              <w:pStyle w:val="Compact"/>
+              <w:jc w:val="right"/>
+            </w:pPr>
+            <w:r>
               <w:t xml:space="preserve">2.49 MB</w:t>
             </w:r>
           </w:p>
@@ -6347,6 +7250,18 @@
             </w:pPr>
             <w:r>
               <w:t xml:space="preserve">65.0 ms</w:t>
+            </w:r>
+          </w:p>
+        </w:tc>
+        <w:tc>
+          <w:tcPr/>
+          <w:p>
+            <w:pPr>
+              <w:pStyle w:val="Compact"/>
+              <w:jc w:val="right"/>
+            </w:pPr>
+            <w:r>
+              <w:t xml:space="preserve">276 mJ</w:t>
             </w:r>
           </w:p>
         </w:tc>
@@ -6394,6 +7309,18 @@
               <w:jc w:val="right"/>
             </w:pPr>
             <w:r>
+              <w:t xml:space="preserve">12,817</w:t>
+            </w:r>
+          </w:p>
+        </w:tc>
+        <w:tc>
+          <w:tcPr/>
+          <w:p>
+            <w:pPr>
+              <w:pStyle w:val="Compact"/>
+              <w:jc w:val="right"/>
+            </w:pPr>
+            <w:r>
               <w:t xml:space="preserve">0.80 MB</w:t>
             </w:r>
           </w:p>
@@ -6419,6 +7346,18 @@
             </w:pPr>
             <w:r>
               <w:t xml:space="preserve">54.2 ms</w:t>
+            </w:r>
+          </w:p>
+        </w:tc>
+        <w:tc>
+          <w:tcPr/>
+          <w:p>
+            <w:pPr>
+              <w:pStyle w:val="Compact"/>
+              <w:jc w:val="right"/>
+            </w:pPr>
+            <w:r>
+              <w:t xml:space="preserve">220 mJ</w:t>
             </w:r>
           </w:p>
         </w:tc>
@@ -6466,6 +7405,18 @@
               <w:jc w:val="right"/>
             </w:pPr>
             <w:r>
+              <w:t xml:space="preserve">4,277</w:t>
+            </w:r>
+          </w:p>
+        </w:tc>
+        <w:tc>
+          <w:tcPr/>
+          <w:p>
+            <w:pPr>
+              <w:pStyle w:val="Compact"/>
+              <w:jc w:val="right"/>
+            </w:pPr>
+            <w:r>
               <w:t xml:space="preserve">0.32 MB</w:t>
             </w:r>
           </w:p>
@@ -6491,6 +7442,18 @@
             </w:pPr>
             <w:r>
               <w:t xml:space="preserve">50.6 ms</w:t>
+            </w:r>
+          </w:p>
+        </w:tc>
+        <w:tc>
+          <w:tcPr/>
+          <w:p>
+            <w:pPr>
+              <w:pStyle w:val="Compact"/>
+              <w:jc w:val="right"/>
+            </w:pPr>
+            <w:r>
+              <w:t xml:space="preserve">183 mJ</w:t>
             </w:r>
           </w:p>
         </w:tc>
@@ -6538,6 +7501,18 @@
               <w:jc w:val="right"/>
             </w:pPr>
             <w:r>
+              <w:t xml:space="preserve">128,107</w:t>
+            </w:r>
+          </w:p>
+        </w:tc>
+        <w:tc>
+          <w:tcPr/>
+          <w:p>
+            <w:pPr>
+              <w:pStyle w:val="Compact"/>
+              <w:jc w:val="right"/>
+            </w:pPr>
+            <w:r>
               <w:t xml:space="preserve">7.30 MB</w:t>
             </w:r>
           </w:p>
@@ -6563,6 +7538,18 @@
             </w:pPr>
             <w:r>
               <w:t xml:space="preserve">90.0 ms</w:t>
+            </w:r>
+          </w:p>
+        </w:tc>
+        <w:tc>
+          <w:tcPr/>
+          <w:p>
+            <w:pPr>
+              <w:pStyle w:val="Compact"/>
+              <w:jc w:val="right"/>
+            </w:pPr>
+            <w:r>
+              <w:t xml:space="preserve">335 mJ</w:t>
             </w:r>
           </w:p>
         </w:tc>
@@ -6610,6 +7597,18 @@
               <w:jc w:val="right"/>
             </w:pPr>
             <w:r>
+              <w:t xml:space="preserve">4,775</w:t>
+            </w:r>
+          </w:p>
+        </w:tc>
+        <w:tc>
+          <w:tcPr/>
+          <w:p>
+            <w:pPr>
+              <w:pStyle w:val="Compact"/>
+              <w:jc w:val="right"/>
+            </w:pPr>
+            <w:r>
               <w:t xml:space="preserve">0.14 MB</w:t>
             </w:r>
           </w:p>
@@ -6635,6 +7634,18 @@
             </w:pPr>
             <w:r>
               <w:t xml:space="preserve">43.3 ms</w:t>
+            </w:r>
+          </w:p>
+        </w:tc>
+        <w:tc>
+          <w:tcPr/>
+          <w:p>
+            <w:pPr>
+              <w:pStyle w:val="Compact"/>
+              <w:jc w:val="right"/>
+            </w:pPr>
+            <w:r>
+              <w:t xml:space="preserve">173 mJ</w:t>
             </w:r>
           </w:p>
         </w:tc>
@@ -6682,6 +7693,18 @@
               <w:jc w:val="right"/>
             </w:pPr>
             <w:r>
+              <w:t xml:space="preserve">511</w:t>
+            </w:r>
+          </w:p>
+        </w:tc>
+        <w:tc>
+          <w:tcPr/>
+          <w:p>
+            <w:pPr>
+              <w:pStyle w:val="Compact"/>
+              <w:jc w:val="right"/>
+            </w:pPr>
+            <w:r>
               <w:t xml:space="preserve">0.019 MB</w:t>
             </w:r>
           </w:p>
@@ -6707,6 +7730,18 @@
             </w:pPr>
             <w:r>
               <w:t xml:space="preserve">43.0 ms</w:t>
+            </w:r>
+          </w:p>
+        </w:tc>
+        <w:tc>
+          <w:tcPr/>
+          <w:p>
+            <w:pPr>
+              <w:pStyle w:val="Compact"/>
+              <w:jc w:val="right"/>
+            </w:pPr>
+            <w:r>
+              <w:t xml:space="preserve">180 mJ</w:t>
             </w:r>
           </w:p>
         </w:tc>
@@ -6754,6 +7789,18 @@
               <w:jc w:val="right"/>
             </w:pPr>
             <w:r>
+              <w:t xml:space="preserve">13,552</w:t>
+            </w:r>
+          </w:p>
+        </w:tc>
+        <w:tc>
+          <w:tcPr/>
+          <w:p>
+            <w:pPr>
+              <w:pStyle w:val="Compact"/>
+              <w:jc w:val="right"/>
+            </w:pPr>
+            <w:r>
               <w:t xml:space="preserve">0.056 MB</w:t>
             </w:r>
           </w:p>
@@ -6779,6 +7826,18 @@
             </w:pPr>
             <w:r>
               <w:t xml:space="preserve">43.7 ms</w:t>
+            </w:r>
+          </w:p>
+        </w:tc>
+        <w:tc>
+          <w:tcPr/>
+          <w:p>
+            <w:pPr>
+              <w:pStyle w:val="Compact"/>
+              <w:jc w:val="right"/>
+            </w:pPr>
+            <w:r>
+              <w:t xml:space="preserve">173 mJ</w:t>
             </w:r>
           </w:p>
         </w:tc>
@@ -6834,6 +7893,22 @@
                 <w:b/>
                 <w:bCs/>
               </w:rPr>
+              <w:t xml:space="preserve">13,754</w:t>
+            </w:r>
+          </w:p>
+        </w:tc>
+        <w:tc>
+          <w:tcPr/>
+          <w:p>
+            <w:pPr>
+              <w:pStyle w:val="Compact"/>
+              <w:jc w:val="right"/>
+            </w:pPr>
+            <w:r>
+              <w:rPr>
+                <w:b/>
+                <w:bCs/>
+              </w:rPr>
               <w:t xml:space="preserve">0.019 MB</w:t>
             </w:r>
           </w:p>
@@ -6882,6 +7957,22 @@
                 <w:b/>
                 <w:bCs/>
               </w:rPr>
+              <w:t xml:space="preserve">178 mJ</w:t>
+            </w:r>
+          </w:p>
+        </w:tc>
+        <w:tc>
+          <w:tcPr/>
+          <w:p>
+            <w:pPr>
+              <w:pStyle w:val="Compact"/>
+              <w:jc w:val="right"/>
+            </w:pPr>
+            <w:r>
+              <w:rPr>
+                <w:b/>
+                <w:bCs/>
+              </w:rPr>
               <w:t xml:space="preserve">0.633</w:t>
             </w:r>
           </w:p>
@@ -7006,8 +8097,8 @@
         <w:t xml:space="preserve">gain on this machine is size, and a speed gain requires int8-capable hardware.</w:t>
       </w:r>
     </w:p>
-    <w:bookmarkEnd w:id="52"/>
-    <w:bookmarkStart w:id="53" w:name="limitations-and-future-work"/>
+    <w:bookmarkEnd w:id="53"/>
+    <w:bookmarkStart w:id="54" w:name="limitations-and-future-work"/>
     <w:p>
       <w:pPr>
         <w:pStyle w:val="Heading1"/>
@@ -7153,6 +8244,34 @@
           <w:b/>
           <w:bCs/>
         </w:rPr>
+        <w:t xml:space="preserve">Explanation grading.</w:t>
+      </w:r>
+      <w:r>
+        <w:t xml:space="preserve"> </w:t>
+      </w:r>
+      <w:r>
+        <w:t xml:space="preserve">The rubric scores need human graders; a 1.5B model judge on this</w:t>
+      </w:r>
+      <w:r>
+        <w:t xml:space="preserve"> </w:t>
+      </w:r>
+      <w:r>
+        <w:t xml:space="preserve">hardware was too slow and did not discriminate right from wrong answers (Section 5.7).</w:t>
+      </w:r>
+    </w:p>
+    <w:p>
+      <w:pPr>
+        <w:pStyle w:val="Compact"/>
+        <w:numPr>
+          <w:ilvl w:val="0"/>
+          <w:numId w:val="1005"/>
+        </w:numPr>
+      </w:pPr>
+      <w:r>
+        <w:rPr>
+          <w:b/>
+          <w:bCs/>
+        </w:rPr>
         <w:t xml:space="preserve">Question coverage.</w:t>
       </w:r>
       <w:r>
@@ -7174,8 +8293,8 @@
         <w:t xml:space="preserve">hybrid parser is the mitigation.</w:t>
       </w:r>
     </w:p>
-    <w:bookmarkEnd w:id="53"/>
-    <w:bookmarkStart w:id="54" w:name="contribution-statement"/>
+    <w:bookmarkEnd w:id="54"/>
+    <w:bookmarkStart w:id="55" w:name="contribution-statement"/>
     <w:p>
       <w:pPr>
         <w:pStyle w:val="Heading1"/>
@@ -7350,8 +8469,8 @@
         </w:tc>
       </w:tr>
     </w:tbl>
-    <w:bookmarkEnd w:id="54"/>
-    <w:bookmarkStart w:id="55" w:name="ai-use-disclosure"/>
+    <w:bookmarkEnd w:id="55"/>
+    <w:bookmarkStart w:id="56" w:name="ai-use-disclosure"/>
     <w:p>
       <w:pPr>
         <w:pStyle w:val="Heading1"/>
@@ -7432,8 +8551,8 @@
         <w:t xml:space="preserve">Section 4. [List any other AI tools used, and what for.]</w:t>
       </w:r>
     </w:p>
-    <w:bookmarkEnd w:id="55"/>
-    <w:bookmarkStart w:id="56" w:name="references"/>
+    <w:bookmarkEnd w:id="56"/>
+    <w:bookmarkStart w:id="57" w:name="references"/>
     <w:p>
       <w:pPr>
         <w:pStyle w:val="Heading1"/>
@@ -7578,7 +8697,7 @@
         <w:t xml:space="preserve">Qwen Team. Qwen2.5 technical report. arXiv:2412.15115, 2024.</w:t>
       </w:r>
     </w:p>
-    <w:bookmarkEnd w:id="56"/>
+    <w:bookmarkEnd w:id="57"/>
     <w:sectPr>
       <w:footnotePr>
         <w:numRestart w:val="eachSect"/>

</xml_diff>

<commit_message>
Update report for the Qwen3 language-model parser
- Rewrite the abstract and section 3.5: Qwen3-1.7B (4-bit, llama.cpp) extracts a
  schema-constrained intent, and the rule parser is now the baseline.
- Section 5.2 now reports the full system (0.612 / 0.462 grounded) beside the rule parser
  (0.636 / 0.475), and discloses the first-prompt run (0.505).
- Answer-level metrics now have rule and SLM columns.
- Section 5.5 compares the Qwen2.5 and Qwen3 parsers (system: 0.84 dev / 0.82 test).
- Add the SLM cost to section 6, update the limitations, add Qwen3 and llama.cpp
  references, and document the web page.
- Shrink figures so the report stays at 12 pages.
- README headline numbers updated.
</commit_message>
<xml_diff>
--- a/report/report.docx
+++ b/report/report.docx
@@ -84,13 +84,19 @@
         <w:t xml:space="preserve"> </w:t>
       </w:r>
       <w:r>
-        <w:t xml:space="preserve">timeline. Questions are parsed into a structured intent and executed as operations on that</w:t>
-      </w:r>
-      <w:r>
-        <w:t xml:space="preserve"> </w:t>
-      </w:r>
-      <w:r>
-        <w:t xml:space="preserve">timeline. The central design rule is that</w:t>
+        <w:t xml:space="preserve">timeline. A small language model, Qwen3-1.7B quantised to 4 bits and run locally with llama.cpp,</w:t>
+      </w:r>
+      <w:r>
+        <w:t xml:space="preserve"> </w:t>
+      </w:r>
+      <w:r>
+        <w:t xml:space="preserve">reads each question into a schema-constrained intent; Python executes it as operations on the</w:t>
+      </w:r>
+      <w:r>
+        <w:t xml:space="preserve"> </w:t>
+      </w:r>
+      <w:r>
+        <w:t xml:space="preserve">timeline, and the model then words the explanation. The central design rule is that</w:t>
       </w:r>
       <w:r>
         <w:t xml:space="preserve"> </w:t>
@@ -100,28 +106,42 @@
           <w:b/>
           <w:bCs/>
         </w:rPr>
-        <w:t xml:space="preserve">the language layer never produces a number</w:t>
-      </w:r>
-      <w:r>
-        <w:t xml:space="preserve">: every</w:t>
-      </w:r>
-      <w:r>
-        <w:t xml:space="preserve"> </w:t>
-      </w:r>
-      <w:r>
-        <w:t xml:space="preserve">duration, count, timestamp and feature value in an answer is read off the timeline. On 767</w:t>
-      </w:r>
-      <w:r>
-        <w:t xml:space="preserve"> </w:t>
-      </w:r>
-      <w:r>
-        <w:t xml:space="preserve">questions over 40 recordings of 12 held-out ExtraSensory users the system answers 63.6% correctly</w:t>
-      </w:r>
-      <w:r>
-        <w:t xml:space="preserve"> </w:t>
-      </w:r>
-      <w:r>
-        <w:t xml:space="preserve">(macro-average over eight question types) and 47.5% correctly</w:t>
+        <w:t xml:space="preserve">the language</w:t>
+      </w:r>
+      <w:r>
+        <w:rPr>
+          <w:b/>
+          <w:bCs/>
+        </w:rPr>
+        <w:t xml:space="preserve"> </w:t>
+      </w:r>
+      <w:r>
+        <w:rPr>
+          <w:b/>
+          <w:bCs/>
+        </w:rPr>
+        <w:t xml:space="preserve">layer never produces a number</w:t>
+      </w:r>
+      <w:r>
+        <w:t xml:space="preserve">: every duration, count, timestamp and feature value in an answer is</w:t>
+      </w:r>
+      <w:r>
+        <w:t xml:space="preserve"> </w:t>
+      </w:r>
+      <w:r>
+        <w:t xml:space="preserve">computed from the timeline, and a model-worded explanation is discarded if it contains a number the</w:t>
+      </w:r>
+      <w:r>
+        <w:t xml:space="preserve"> </w:t>
+      </w:r>
+      <w:r>
+        <w:t xml:space="preserve">pipeline did not compute. On 767 questions over 40 recordings of 12 held-out ExtraSensory users the</w:t>
+      </w:r>
+      <w:r>
+        <w:t xml:space="preserve"> </w:t>
+      </w:r>
+      <w:r>
+        <w:t xml:space="preserve">system answers 61.2% correctly (macro-average over eight question types) and 46.2% correctly</w:t>
       </w:r>
       <w:r>
         <w:t xml:space="preserve"> </w:t>
@@ -137,25 +157,25 @@
         <w:t xml:space="preserve"> </w:t>
       </w:r>
       <w:r>
-        <w:t xml:space="preserve">correct evidence. Temporal</w:t>
-      </w:r>
-      <w:r>
-        <w:t xml:space="preserve"> </w:t>
-      </w:r>
-      <w:r>
-        <w:t xml:space="preserve">decoding raised these from 55.3% and 38.1%. A rule-based parser hardened on a development set</w:t>
-      </w:r>
-      <w:r>
-        <w:t xml:space="preserve"> </w:t>
-      </w:r>
-      <w:r>
-        <w:t xml:space="preserve">reaches 96% intent accuracy on unseen hand-written questions, well above small language models used</w:t>
-      </w:r>
-      <w:r>
-        <w:t xml:space="preserve"> </w:t>
-      </w:r>
-      <w:r>
-        <w:t xml:space="preserve">as parsers (58–62% intent accuracy for Qwen2.5-0.5B). For the efficiency extra credit, a distilled, 8-bit quantised MLP is 380×</w:t>
+        <w:t xml:space="preserve">correct evidence, against 63.6% and 47.5% for a hand-tuned rule parser that we built first and keep</w:t>
+      </w:r>
+      <w:r>
+        <w:t xml:space="preserve"> </w:t>
+      </w:r>
+      <w:r>
+        <w:t xml:space="preserve">as a baseline. Temporal decoding raised the rule-parser figures from 55.3% and 38.1%. On unseen</w:t>
+      </w:r>
+      <w:r>
+        <w:t xml:space="preserve"> </w:t>
+      </w:r>
+      <w:r>
+        <w:t xml:space="preserve">hand-written questions the language model reaches 82% intent accuracy (rules: 96%), at about 2 s per</w:t>
+      </w:r>
+      <w:r>
+        <w:t xml:space="preserve"> </w:t>
+      </w:r>
+      <w:r>
+        <w:t xml:space="preserve">question on a laptop. For the efficiency extra credit, a distilled, 8-bit quantised MLP is 380×</w:t>
       </w:r>
       <w:r>
         <w:t xml:space="preserve"> </w:t>
@@ -375,7 +395,13 @@
         <w:t xml:space="preserve"> </w:t>
       </w:r>
       <w:r>
-        <w:t xml:space="preserve">to match the signal, so all quantitative content must come from a deterministic structure. Second,</w:t>
+        <w:t xml:space="preserve">to match the signal, so all quantitative content must come from a deterministic structure; a</w:t>
+      </w:r>
+      <w:r>
+        <w:t xml:space="preserve"> </w:t>
+      </w:r>
+      <w:r>
+        <w:t xml:space="preserve">language model may read the question and word the explanation, but not compute. Second,</w:t>
       </w:r>
       <w:r>
         <w:t xml:space="preserve"> </w:t>
@@ -1260,13 +1286,13 @@
         <w:t xml:space="preserve"> </w:t>
       </w:r>
       <w:r>
-        <w:t xml:space="preserve">parser work into a development set (55 questions, used to improve the parser) and a test set (50,</w:t>
-      </w:r>
-      <w:r>
-        <w:t xml:space="preserve"> </w:t>
-      </w:r>
-      <w:r>
-        <w:t xml:space="preserve">only scored, before and after).</w:t>
+        <w:t xml:space="preserve">parser work into a development set (55 questions, used to improve the parsers and the prompt) and</w:t>
+      </w:r>
+      <w:r>
+        <w:t xml:space="preserve"> </w:t>
+      </w:r>
+      <w:r>
+        <w:t xml:space="preserve">a test set (50, only scored).</w:t>
       </w:r>
     </w:p>
     <w:p>
@@ -1559,7 +1585,7 @@
       <w:r>
         <w:drawing>
           <wp:inline>
-            <wp:extent cx="5334000" cy="1600200"/>
+            <wp:extent cx="4800600" cy="1440180"/>
             <wp:effectExtent b="0" l="0" r="0" t="0"/>
             <wp:docPr descr="System architecture. Every quantitative statement in an answer is read off the timeline." title="" id="16" name="Picture"/>
             <a:graphic>
@@ -1580,7 +1606,7 @@
                   <pic:spPr bwMode="auto">
                     <a:xfrm>
                       <a:off x="0" y="0"/>
-                      <a:ext cx="5334000" cy="1600200"/>
+                      <a:ext cx="4800600" cy="1440180"/>
                     </a:xfrm>
                     <a:prstGeom prst="rect">
                       <a:avLst/>
@@ -2132,7 +2158,7 @@
       <w:r>
         <w:drawing>
           <wp:inline>
-            <wp:extent cx="5334000" cy="1280160"/>
+            <wp:extent cx="3840480" cy="921715"/>
             <wp:effectExtent b="0" l="0" r="0" t="0"/>
             <wp:docPr descr="Decoder tuning on held-out training users. Dashed: moving-average baseline." title="" id="22" name="Picture"/>
             <a:graphic>
@@ -2153,7 +2179,7 @@
                   <pic:spPr bwMode="auto">
                     <a:xfrm>
                       <a:off x="0" y="0"/>
-                      <a:ext cx="5334000" cy="1280160"/>
+                      <a:ext cx="3840480" cy="921715"/>
                     </a:xfrm>
                     <a:prstGeom prst="rect">
                       <a:avLst/>
@@ -2312,138 +2338,35 @@
         <w:pStyle w:val="BodyText"/>
       </w:pPr>
       <w:r>
-        <w:t xml:space="preserve">The default parser is rule-based: deterministic, about 0.3 ms per question, and fully reproducible.</w:t>
-      </w:r>
-      <w:r>
-        <w:t xml:space="preserve"> </w:t>
-      </w:r>
-      <w:r>
-        <w:t xml:space="preserve">It normalises spoken forms (number words,</w:t>
-      </w:r>
-      <w:r>
-        <w:t xml:space="preserve"> </w:t>
-      </w:r>
-      <w:r>
-        <w:t xml:space="preserve">“half an hour”</w:t>
-      </w:r>
-      <w:r>
-        <w:t xml:space="preserve">,</w:t>
-      </w:r>
-      <w:r>
-        <w:t xml:space="preserve"> </w:t>
-      </w:r>
-      <w:r>
-        <w:t xml:space="preserve">“final”</w:t>
-      </w:r>
-      <w:r>
-        <w:t xml:space="preserve">,</w:t>
-      </w:r>
-      <w:r>
-        <w:t xml:space="preserve"> </w:t>
-      </w:r>
-      <w:r>
-        <w:t xml:space="preserve">“minute 3”</w:t>
-      </w:r>
-      <w:r>
-        <w:t xml:space="preserve">), corrects misspelt</w:t>
-      </w:r>
-      <w:r>
-        <w:t xml:space="preserve"> </w:t>
-      </w:r>
-      <w:r>
-        <w:t xml:space="preserve">activity words (same first letter, ≥ 88% string similarity, with a list of real words such as</w:t>
-      </w:r>
-      <w:r>
-        <w:t xml:space="preserve"> </w:t>
-      </w:r>
-      <w:r>
-        <w:t xml:space="preserve">“waking”</w:t>
-      </w:r>
-      <w:r>
-        <w:t xml:space="preserve"> </w:t>
-      </w:r>
-      <w:r>
-        <w:t xml:space="preserve">that are never corrected), resolves relative ranges (</w:t>
-      </w:r>
-      <w:r>
-        <w:t xml:space="preserve">“first 10 minutes”</w:t>
-      </w:r>
-      <w:r>
-        <w:t xml:space="preserve">,</w:t>
-      </w:r>
-      <w:r>
-        <w:t xml:space="preserve"> </w:t>
-      </w:r>
-      <w:r>
-        <w:t xml:space="preserve">“after 20</w:t>
-      </w:r>
-      <w:r>
-        <w:t xml:space="preserve"> </w:t>
-      </w:r>
-      <w:r>
-        <w:t xml:space="preserve">minutes”</w:t>
-      </w:r>
-      <w:r>
-        <w:t xml:space="preserve">,</w:t>
-      </w:r>
-      <w:r>
-        <w:t xml:space="preserve"> </w:t>
-      </w:r>
-      <w:r>
-        <w:t xml:space="preserve">“45 minutes in”</w:t>
-      </w:r>
-      <w:r>
-        <w:t xml:space="preserve">), clock times (± 30 min) and day periods (clipped to the recording), and</w:t>
-      </w:r>
-      <w:r>
-        <w:t xml:space="preserve"> </w:t>
-      </w:r>
-      <w:r>
-        <w:t xml:space="preserve">selects the operation by ordered patterns. Questions that ask for unmeasurable quantities (heart</w:t>
-      </w:r>
-      <w:r>
-        <w:t xml:space="preserve"> </w:t>
-      </w:r>
-      <w:r>
-        <w:t xml:space="preserve">rate, location, mood) are routed to an explicit refusal rather than answered from motion.</w:t>
-      </w:r>
-    </w:p>
-    <w:p>
-      <w:pPr>
-        <w:pStyle w:val="BodyText"/>
-      </w:pPr>
-      <w:r>
-        <w:t xml:space="preserve">An optional small language model (Qwen2.5-0.5B-Instruct by default, few-shot prompted) produces the</w:t>
-      </w:r>
-      <w:r>
-        <w:t xml:space="preserve"> </w:t>
-      </w:r>
-      <w:r>
-        <w:t xml:space="preserve">same intent as JSON. By design it only decides the operation and the activities; time ranges stay</w:t>
-      </w:r>
-      <w:r>
-        <w:t xml:space="preserve"> </w:t>
-      </w:r>
-      <w:r>
-        <w:t xml:space="preserve">with the deterministic extractor, because small models are unreliable at converting</w:t>
-      </w:r>
-      <w:r>
-        <w:t xml:space="preserve"> </w:t>
-      </w:r>
-      <w:r>
-        <w:t xml:space="preserve">“around 10:15”</w:t>
-      </w:r>
-      <w:r>
-        <w:t xml:space="preserve"> </w:t>
-      </w:r>
-      <w:r>
-        <w:t xml:space="preserve">into seconds from the recording start. Its output is validated against the schema; anything invalid</w:t>
-      </w:r>
-      <w:r>
-        <w:t xml:space="preserve"> </w:t>
-      </w:r>
-      <w:r>
-        <w:t xml:space="preserve">falls back to the rules. In</w:t>
+        <w:rPr>
+          <w:b/>
+          <w:bCs/>
+        </w:rPr>
+        <w:t xml:space="preserve">Language-model parser (the system).</w:t>
+      </w:r>
+      <w:r>
+        <w:t xml:space="preserve"> </w:t>
+      </w:r>
+      <w:r>
+        <w:t xml:space="preserve">Qwen3-1.7B, quantised to 4 bits (Q4_K_M GGUF, 1.0 GB), runs</w:t>
+      </w:r>
+      <w:r>
+        <w:t xml:space="preserve"> </w:t>
+      </w:r>
+      <w:r>
+        <w:t xml:space="preserve">locally through llama.cpp (Metal GPU, thinking mode off, greedy decoding). A fixed prompt with 22</w:t>
+      </w:r>
+      <w:r>
+        <w:t xml:space="preserve"> </w:t>
+      </w:r>
+      <w:r>
+        <w:t xml:space="preserve">worked examples, unlike the evaluation phrasings, asks for a JSON object: the operation, the</w:t>
+      </w:r>
+      <w:r>
+        <w:t xml:space="preserve"> </w:t>
+      </w:r>
+      <w:r>
+        <w:t xml:space="preserve">activity groups, the time expression</w:t>
       </w:r>
       <w:r>
         <w:t xml:space="preserve"> </w:t>
@@ -2453,19 +2376,79 @@
           <w:i/>
           <w:iCs/>
         </w:rPr>
-        <w:t xml:space="preserve">hybrid</w:t>
-      </w:r>
-      <w:r>
-        <w:t xml:space="preserve"> </w:t>
-      </w:r>
-      <w:r>
-        <w:t xml:space="preserve">mode the rules answer first and the model is consulted only</w:t>
-      </w:r>
-      <w:r>
-        <w:t xml:space="preserve"> </w:t>
-      </w:r>
-      <w:r>
-        <w:t xml:space="preserve">when the rule parse looks uncertain. Section 5.5 compares the options.</w:t>
+        <w:t xml:space="preserve">as written</w:t>
+      </w:r>
+      <w:r>
+        <w:t xml:space="preserve"> </w:t>
+      </w:r>
+      <w:r>
+        <w:t xml:space="preserve">(kind — between, after, before, first, last, at,</w:t>
+      </w:r>
+      <w:r>
+        <w:t xml:space="preserve"> </w:t>
+      </w:r>
+      <w:r>
+        <w:t xml:space="preserve">clock, day period — with its numbers, unit, clock time or period) and, for open-world questions, the</w:t>
+      </w:r>
+      <w:r>
+        <w:t xml:space="preserve"> </w:t>
+      </w:r>
+      <w:r>
+        <w:t xml:space="preserve">topic (e.g. exercise, sleep, heart rate). llama.cpp compiles the JSON schema into a grammar, so the</w:t>
+      </w:r>
+      <w:r>
+        <w:t xml:space="preserve"> </w:t>
+      </w:r>
+      <w:r>
+        <w:t xml:space="preserve">output is always well-formed and names only known operations and classes. Python converts the time</w:t>
+      </w:r>
+      <w:r>
+        <w:t xml:space="preserve"> </w:t>
+      </w:r>
+      <w:r>
+        <w:t xml:space="preserve">expression into seconds from the recording start; the model does no arithmetic. A day period or</w:t>
+      </w:r>
+      <w:r>
+        <w:t xml:space="preserve"> </w:t>
+      </w:r>
+      <w:r>
+        <w:t xml:space="preserve">clock time absent from the question is dropped, and a comparison with one activity is answered as</w:t>
+      </w:r>
+      <w:r>
+        <w:t xml:space="preserve"> </w:t>
+      </w:r>
+      <w:r>
+        <w:t xml:space="preserve">that activity’s duration. Qwen3-0.6B (378 MB) can be chosen for speed.</w:t>
+      </w:r>
+    </w:p>
+    <w:p>
+      <w:pPr>
+        <w:pStyle w:val="BodyText"/>
+      </w:pPr>
+      <w:r>
+        <w:rPr>
+          <w:b/>
+          <w:bCs/>
+        </w:rPr>
+        <w:t xml:space="preserve">Rule parser (baseline).</w:t>
+      </w:r>
+      <w:r>
+        <w:t xml:space="preserve"> </w:t>
+      </w:r>
+      <w:r>
+        <w:t xml:space="preserve">A deterministic parser built first (spoken-form normalisation, typo</w:t>
+      </w:r>
+      <w:r>
+        <w:t xml:space="preserve"> </w:t>
+      </w:r>
+      <w:r>
+        <w:t xml:space="preserve">correction, time patterns, ordered operation patterns; 0.3 ms per question) is kept as a baseline</w:t>
+      </w:r>
+      <w:r>
+        <w:t xml:space="preserve"> </w:t>
+      </w:r>
+      <w:r>
+        <w:t xml:space="preserve">and used where an experiment should isolate the sensor pipeline (Sections 5.3, 5.4 and 6).</w:t>
       </w:r>
     </w:p>
     <w:bookmarkEnd w:id="25"/>
@@ -3004,6 +2987,36 @@
       <w:r>
         <w:t xml:space="preserve">is still grounded by citing what the user was doing instead.</w:t>
       </w:r>
+      <w:r>
+        <w:t xml:space="preserve"> </w:t>
+      </w:r>
+      <w:r>
+        <w:t xml:space="preserve">The language model then rewords this template in plain sentences from the computed fields only;</w:t>
+      </w:r>
+      <w:r>
+        <w:t xml:space="preserve"> </w:t>
+      </w:r>
+      <w:r>
+        <w:t xml:space="preserve">its text is kept only if every number in it appears in those fields (otherwise the template is used:</w:t>
+      </w:r>
+      <w:r>
+        <w:t xml:space="preserve"> </w:t>
+      </w:r>
+      <w:r>
+        <w:t xml:space="preserve">14 of 670 explanations), and</w:t>
+      </w:r>
+      <w:r>
+        <w:t xml:space="preserve"> </w:t>
+      </w:r>
+      <w:r>
+        <w:t xml:space="preserve">“N/A”</w:t>
+      </w:r>
+      <w:r>
+        <w:t xml:space="preserve"> </w:t>
+      </w:r>
+      <w:r>
+        <w:t xml:space="preserve">answers are never reworded.</w:t>
+      </w:r>
     </w:p>
     <w:bookmarkEnd w:id="26"/>
     <w:bookmarkStart w:id="27" w:name="open-world-reasoning"/>
@@ -3539,7 +3552,7 @@
               <w:rPr>
                 <w:rStyle w:val="VerbatimChar"/>
               </w:rPr>
-              <w:t xml:space="preserve">scripts/answer.py --recording r.csv --questions q.txt</w:t>
+              <w:t xml:space="preserve">scripts/answer.py --recording r.csv --questions q.txt [--slm Qwen3-0.6B]</w:t>
             </w:r>
           </w:p>
         </w:tc>
@@ -3551,6 +3564,44 @@
             </w:pPr>
             <w:r>
               <w:t xml:space="preserve">6-field answers</w:t>
+            </w:r>
+          </w:p>
+        </w:tc>
+      </w:tr>
+      <w:tr>
+        <w:tc>
+          <w:tcPr/>
+          <w:p>
+            <w:pPr>
+              <w:pStyle w:val="Compact"/>
+            </w:pPr>
+            <w:r>
+              <w:t xml:space="preserve">Web page</w:t>
+            </w:r>
+          </w:p>
+        </w:tc>
+        <w:tc>
+          <w:tcPr/>
+          <w:p>
+            <w:pPr>
+              <w:pStyle w:val="Compact"/>
+            </w:pPr>
+            <w:r>
+              <w:rPr>
+                <w:rStyle w:val="VerbatimChar"/>
+              </w:rPr>
+              <w:t xml:space="preserve">streamlit run app.py</w:t>
+            </w:r>
+          </w:p>
+        </w:tc>
+        <w:tc>
+          <w:tcPr/>
+          <w:p>
+            <w:pPr>
+              <w:pStyle w:val="Compact"/>
+            </w:pPr>
+            <w:r>
+              <w:t xml:space="preserve">upload, choose model, ask</w:t>
             </w:r>
           </w:p>
         </w:tc>
@@ -3627,7 +3678,34 @@
         <w:t xml:space="preserve"> </w:t>
       </w:r>
       <w:r>
-        <w:t xml:space="preserve">matching; a 4.4-hour recording is loaded and 11 questions answered in about 2 s on a laptop.</w:t>
+        <w:t xml:space="preserve">matching; a 4.4-hour recording is processed in under 1 s, after which each question takes 2–5 s,</w:t>
+      </w:r>
+      <w:r>
+        <w:t xml:space="preserve"> </w:t>
+      </w:r>
+      <w:r>
+        <w:t xml:space="preserve">almost all of it the language model. A Streamlit page (</w:t>
+      </w:r>
+      <w:r>
+        <w:rPr>
+          <w:rStyle w:val="VerbatimChar"/>
+        </w:rPr>
+        <w:t xml:space="preserve">app.py</w:t>
+      </w:r>
+      <w:r>
+        <w:t xml:space="preserve">) offers the same pipeline: upload one</w:t>
+      </w:r>
+      <w:r>
+        <w:t xml:space="preserve"> </w:t>
+      </w:r>
+      <w:r>
+        <w:t xml:space="preserve">or more recordings, choose Qwen3-1.7B or Qwen3-0.6B, ask a question and read the six-field answer</w:t>
+      </w:r>
+      <w:r>
+        <w:t xml:space="preserve"> </w:t>
+      </w:r>
+      <w:r>
+        <w:t xml:space="preserve">with the recognised activity timeline.</w:t>
       </w:r>
     </w:p>
     <w:bookmarkEnd w:id="29"/>
@@ -3656,7 +3734,7 @@
       <w:r>
         <w:drawing>
           <wp:inline>
-            <wp:extent cx="3307080" cy="2834640"/>
+            <wp:extent cx="2667000" cy="2286000"/>
             <wp:effectExtent b="0" l="0" r="0" t="0"/>
             <wp:docPr descr="Figure 2. Window-level confusion matrix on the 12 test users (raw classifier output, before temporal decoding)." title="" id="31" name="Picture"/>
             <a:graphic>
@@ -3677,7 +3755,7 @@
                   <pic:spPr bwMode="auto">
                     <a:xfrm>
                       <a:off x="0" y="0"/>
-                      <a:ext cx="3307080" cy="2834640"/>
+                      <a:ext cx="2667000" cy="2286000"/>
                     </a:xfrm>
                     <a:prstGeom prst="rect">
                       <a:avLst/>
@@ -4257,14 +4335,14 @@
       <w:r>
         <w:drawing>
           <wp:inline>
-            <wp:extent cx="4693920" cy="2112264"/>
+            <wp:extent cx="3627120" cy="1632204"/>
             <wp:effectExtent b="0" l="0" r="0" t="0"/>
-            <wp:docPr descr="Figure 1. QA accuracy by question type on 767 questions over 40 held-out recordings, with the correctness rule under each type. Blue: answer correct; orange: answer correct and evidence grounded." title="" id="35" name="Picture"/>
+            <wp:docPr descr="Figure 1. QA accuracy of the full system (Qwen3-1.7B parser) by question type on 767 questions over 40 held-out recordings, with the correctness rule under each type. Blue: answer correct; orange: answer correct and evidence grounded." title="" id="35" name="Picture"/>
             <a:graphic>
               <a:graphicData uri="http://schemas.openxmlformats.org/drawingml/2006/picture">
                 <pic:pic>
                   <pic:nvPicPr>
-                    <pic:cNvPr descr="../results/extrasensory/fig1_accuracy_by_type_hgb_full_hmm.png" id="36" name="Picture"/>
+                    <pic:cNvPr descr="../results/extrasensory/fig1_accuracy_by_type_hgb_full_hmm_slm_slm.png" id="36" name="Picture"/>
                     <pic:cNvPicPr>
                       <a:picLocks noChangeArrowheads="1" noChangeAspect="1"/>
                     </pic:cNvPicPr>
@@ -4278,7 +4356,7 @@
                   <pic:spPr bwMode="auto">
                     <a:xfrm>
                       <a:off x="0" y="0"/>
-                      <a:ext cx="4693920" cy="2112264"/>
+                      <a:ext cx="3627120" cy="1632204"/>
                     </a:xfrm>
                     <a:prstGeom prst="rect">
                       <a:avLst/>
@@ -4302,7 +4380,7 @@
         <w:pStyle w:val="ImageCaption"/>
       </w:pPr>
       <w:r>
-        <w:t xml:space="preserve">Figure 1. QA accuracy by question type on 767 questions over 40 held-out recordings, with the correctness rule under each type. Blue: answer correct; orange: answer correct and evidence grounded.</w:t>
+        <w:t xml:space="preserve">Figure 1. QA accuracy of the full system (Qwen3-1.7B parser) by question type on 767 questions over 40 held-out recordings, with the correctness rule under each type. Blue: answer correct; orange: answer correct and evidence grounded.</w:t>
       </w:r>
     </w:p>
     <w:p>
@@ -4310,7 +4388,7 @@
         <w:pStyle w:val="TableCaption"/>
       </w:pPr>
       <w:r>
-        <w:t xml:space="preserve">QA accuracy before and after temporal decoding (same model, same questions).</w:t>
+        <w:t xml:space="preserve">QA accuracy by parser and decoder (same classifier, same questions). MA: moving-average smoothing. SLM: the Qwen3-1.7B system.</w:t>
       </w:r>
     </w:p>
     <w:tbl>
@@ -4319,14 +4397,15 @@
         <w:tblW w:type="pct" w:w="5000"/>
         <w:tblLayout w:type="fixed"/>
         <w:tblLook w:firstRow="1" w:lastRow="0" w:firstColumn="0" w:lastColumn="0" w:noHBand="0" w:noVBand="0" w:val="0020"/>
-        <w:tblCaption w:val="QA accuracy before and after temporal decoding (same model, same questions)."/>
+        <w:tblCaption w:val="QA accuracy by parser and decoder (same classifier, same questions). MA: moving-average smoothing. SLM: the Qwen3-1.7B system."/>
       </w:tblPr>
       <w:tblGrid>
-        <w:gridCol w:w="1250"/>
-        <w:gridCol w:w="1667"/>
-        <w:gridCol w:w="1667"/>
-        <w:gridCol w:w="1667"/>
-        <w:gridCol w:w="1667"/>
+        <w:gridCol w:w="1033"/>
+        <w:gridCol w:w="1377"/>
+        <w:gridCol w:w="1377"/>
+        <w:gridCol w:w="1377"/>
+        <w:gridCol w:w="1377"/>
+        <w:gridCol w:w="1377"/>
       </w:tblGrid>
       <w:tr>
         <w:trPr>
@@ -4351,7 +4430,19 @@
               <w:jc w:val="right"/>
             </w:pPr>
             <w:r>
-              <w:t xml:space="preserve">Moving average</w:t>
+              <w:t xml:space="preserve">Rules, MA</w:t>
+            </w:r>
+          </w:p>
+        </w:tc>
+        <w:tc>
+          <w:tcPr/>
+          <w:p>
+            <w:pPr>
+              <w:pStyle w:val="Compact"/>
+              <w:jc w:val="right"/>
+            </w:pPr>
+            <w:r>
+              <w:t xml:space="preserve">Rules, HMM</w:t>
             </w:r>
           </w:p>
         </w:tc>
@@ -4367,19 +4458,19 @@
                 <w:b/>
                 <w:bCs/>
               </w:rPr>
-              <w:t xml:space="preserve">HMM</w:t>
-            </w:r>
-          </w:p>
-        </w:tc>
-        <w:tc>
-          <w:tcPr/>
-          <w:p>
-            <w:pPr>
-              <w:pStyle w:val="Compact"/>
-              <w:jc w:val="right"/>
-            </w:pPr>
-            <w:r>
-              <w:t xml:space="preserve">Grounded, MA</w:t>
+              <w:t xml:space="preserve">SLM, HMM</w:t>
+            </w:r>
+          </w:p>
+        </w:tc>
+        <w:tc>
+          <w:tcPr/>
+          <w:p>
+            <w:pPr>
+              <w:pStyle w:val="Compact"/>
+              <w:jc w:val="right"/>
+            </w:pPr>
+            <w:r>
+              <w:t xml:space="preserve">Grounded, rules, HMM</w:t>
             </w:r>
           </w:p>
         </w:tc>
@@ -4395,7 +4486,7 @@
                 <w:b/>
                 <w:bCs/>
               </w:rPr>
-              <w:t xml:space="preserve">Grounded, HMM</w:t>
+              <w:t xml:space="preserve">Grounded, SLM, HMM</w:t>
             </w:r>
           </w:p>
         </w:tc>
@@ -4421,6 +4512,18 @@
             </w:pPr>
             <w:r>
               <w:t xml:space="preserve">0.51</w:t>
+            </w:r>
+          </w:p>
+        </w:tc>
+        <w:tc>
+          <w:tcPr/>
+          <w:p>
+            <w:pPr>
+              <w:pStyle w:val="Compact"/>
+              <w:jc w:val="right"/>
+            </w:pPr>
+            <w:r>
+              <w:t xml:space="preserve">0.56</w:t>
             </w:r>
           </w:p>
         </w:tc>
@@ -4436,19 +4539,19 @@
                 <w:b/>
                 <w:bCs/>
               </w:rPr>
-              <w:t xml:space="preserve">0.56</w:t>
-            </w:r>
-          </w:p>
-        </w:tc>
-        <w:tc>
-          <w:tcPr/>
-          <w:p>
-            <w:pPr>
-              <w:pStyle w:val="Compact"/>
-              <w:jc w:val="right"/>
-            </w:pPr>
-            <w:r>
-              <w:t xml:space="preserve">0.44</w:t>
+              <w:t xml:space="preserve">0.53</w:t>
+            </w:r>
+          </w:p>
+        </w:tc>
+        <w:tc>
+          <w:tcPr/>
+          <w:p>
+            <w:pPr>
+              <w:pStyle w:val="Compact"/>
+              <w:jc w:val="right"/>
+            </w:pPr>
+            <w:r>
+              <w:t xml:space="preserve">0.55</w:t>
             </w:r>
           </w:p>
         </w:tc>
@@ -4464,7 +4567,7 @@
                 <w:b/>
                 <w:bCs/>
               </w:rPr>
-              <w:t xml:space="preserve">0.55</w:t>
+              <w:t xml:space="preserve">0.49</w:t>
             </w:r>
           </w:p>
         </w:tc>
@@ -4490,6 +4593,504 @@
             </w:pPr>
             <w:r>
               <w:t xml:space="preserve">0.73</w:t>
+            </w:r>
+          </w:p>
+        </w:tc>
+        <w:tc>
+          <w:tcPr/>
+          <w:p>
+            <w:pPr>
+              <w:pStyle w:val="Compact"/>
+              <w:jc w:val="right"/>
+            </w:pPr>
+            <w:r>
+              <w:t xml:space="preserve">0.76</w:t>
+            </w:r>
+          </w:p>
+        </w:tc>
+        <w:tc>
+          <w:tcPr/>
+          <w:p>
+            <w:pPr>
+              <w:pStyle w:val="Compact"/>
+              <w:jc w:val="right"/>
+            </w:pPr>
+            <w:r>
+              <w:rPr>
+                <w:b/>
+                <w:bCs/>
+              </w:rPr>
+              <w:t xml:space="preserve">0.69</w:t>
+            </w:r>
+          </w:p>
+        </w:tc>
+        <w:tc>
+          <w:tcPr/>
+          <w:p>
+            <w:pPr>
+              <w:pStyle w:val="Compact"/>
+              <w:jc w:val="right"/>
+            </w:pPr>
+            <w:r>
+              <w:t xml:space="preserve">0.71</w:t>
+            </w:r>
+          </w:p>
+        </w:tc>
+        <w:tc>
+          <w:tcPr/>
+          <w:p>
+            <w:pPr>
+              <w:pStyle w:val="Compact"/>
+              <w:jc w:val="right"/>
+            </w:pPr>
+            <w:r>
+              <w:rPr>
+                <w:b/>
+                <w:bCs/>
+              </w:rPr>
+              <w:t xml:space="preserve">0.65</w:t>
+            </w:r>
+          </w:p>
+        </w:tc>
+      </w:tr>
+      <w:tr>
+        <w:tc>
+          <w:tcPr/>
+          <w:p>
+            <w:pPr>
+              <w:pStyle w:val="Compact"/>
+            </w:pPr>
+            <w:r>
+              <w:t xml:space="preserve">Duration</w:t>
+            </w:r>
+          </w:p>
+        </w:tc>
+        <w:tc>
+          <w:tcPr/>
+          <w:p>
+            <w:pPr>
+              <w:pStyle w:val="Compact"/>
+              <w:jc w:val="right"/>
+            </w:pPr>
+            <w:r>
+              <w:t xml:space="preserve">0.29</w:t>
+            </w:r>
+          </w:p>
+        </w:tc>
+        <w:tc>
+          <w:tcPr/>
+          <w:p>
+            <w:pPr>
+              <w:pStyle w:val="Compact"/>
+              <w:jc w:val="right"/>
+            </w:pPr>
+            <w:r>
+              <w:t xml:space="preserve">0.44</w:t>
+            </w:r>
+          </w:p>
+        </w:tc>
+        <w:tc>
+          <w:tcPr/>
+          <w:p>
+            <w:pPr>
+              <w:pStyle w:val="Compact"/>
+              <w:jc w:val="right"/>
+            </w:pPr>
+            <w:r>
+              <w:rPr>
+                <w:b/>
+                <w:bCs/>
+              </w:rPr>
+              <w:t xml:space="preserve">0.42</w:t>
+            </w:r>
+          </w:p>
+        </w:tc>
+        <w:tc>
+          <w:tcPr/>
+          <w:p>
+            <w:pPr>
+              <w:pStyle w:val="Compact"/>
+              <w:jc w:val="right"/>
+            </w:pPr>
+            <w:r>
+              <w:t xml:space="preserve">0.37</w:t>
+            </w:r>
+          </w:p>
+        </w:tc>
+        <w:tc>
+          <w:tcPr/>
+          <w:p>
+            <w:pPr>
+              <w:pStyle w:val="Compact"/>
+              <w:jc w:val="right"/>
+            </w:pPr>
+            <w:r>
+              <w:rPr>
+                <w:b/>
+                <w:bCs/>
+              </w:rPr>
+              <w:t xml:space="preserve">0.36</w:t>
+            </w:r>
+          </w:p>
+        </w:tc>
+      </w:tr>
+      <w:tr>
+        <w:tc>
+          <w:tcPr/>
+          <w:p>
+            <w:pPr>
+              <w:pStyle w:val="Compact"/>
+            </w:pPr>
+            <w:r>
+              <w:t xml:space="preserve">Count</w:t>
+            </w:r>
+          </w:p>
+        </w:tc>
+        <w:tc>
+          <w:tcPr/>
+          <w:p>
+            <w:pPr>
+              <w:pStyle w:val="Compact"/>
+              <w:jc w:val="right"/>
+            </w:pPr>
+            <w:r>
+              <w:t xml:space="preserve">0.37</w:t>
+            </w:r>
+          </w:p>
+        </w:tc>
+        <w:tc>
+          <w:tcPr/>
+          <w:p>
+            <w:pPr>
+              <w:pStyle w:val="Compact"/>
+              <w:jc w:val="right"/>
+            </w:pPr>
+            <w:r>
+              <w:t xml:space="preserve">0.57</w:t>
+            </w:r>
+          </w:p>
+        </w:tc>
+        <w:tc>
+          <w:tcPr/>
+          <w:p>
+            <w:pPr>
+              <w:pStyle w:val="Compact"/>
+              <w:jc w:val="right"/>
+            </w:pPr>
+            <w:r>
+              <w:rPr>
+                <w:b/>
+                <w:bCs/>
+              </w:rPr>
+              <w:t xml:space="preserve">0.57</w:t>
+            </w:r>
+          </w:p>
+        </w:tc>
+        <w:tc>
+          <w:tcPr/>
+          <w:p>
+            <w:pPr>
+              <w:pStyle w:val="Compact"/>
+              <w:jc w:val="right"/>
+            </w:pPr>
+            <w:r>
+              <w:t xml:space="preserve">0.42</w:t>
+            </w:r>
+          </w:p>
+        </w:tc>
+        <w:tc>
+          <w:tcPr/>
+          <w:p>
+            <w:pPr>
+              <w:pStyle w:val="Compact"/>
+              <w:jc w:val="right"/>
+            </w:pPr>
+            <w:r>
+              <w:rPr>
+                <w:b/>
+                <w:bCs/>
+              </w:rPr>
+              <w:t xml:space="preserve">0.42</w:t>
+            </w:r>
+          </w:p>
+        </w:tc>
+      </w:tr>
+      <w:tr>
+        <w:tc>
+          <w:tcPr/>
+          <w:p>
+            <w:pPr>
+              <w:pStyle w:val="Compact"/>
+            </w:pPr>
+            <w:r>
+              <w:t xml:space="preserve">Comparison</w:t>
+            </w:r>
+          </w:p>
+        </w:tc>
+        <w:tc>
+          <w:tcPr/>
+          <w:p>
+            <w:pPr>
+              <w:pStyle w:val="Compact"/>
+              <w:jc w:val="right"/>
+            </w:pPr>
+            <w:r>
+              <w:t xml:space="preserve">0.79</w:t>
+            </w:r>
+          </w:p>
+        </w:tc>
+        <w:tc>
+          <w:tcPr/>
+          <w:p>
+            <w:pPr>
+              <w:pStyle w:val="Compact"/>
+              <w:jc w:val="right"/>
+            </w:pPr>
+            <w:r>
+              <w:t xml:space="preserve">0.90</w:t>
+            </w:r>
+          </w:p>
+        </w:tc>
+        <w:tc>
+          <w:tcPr/>
+          <w:p>
+            <w:pPr>
+              <w:pStyle w:val="Compact"/>
+              <w:jc w:val="right"/>
+            </w:pPr>
+            <w:r>
+              <w:rPr>
+                <w:b/>
+                <w:bCs/>
+              </w:rPr>
+              <w:t xml:space="preserve">0.82</w:t>
+            </w:r>
+          </w:p>
+        </w:tc>
+        <w:tc>
+          <w:tcPr/>
+          <w:p>
+            <w:pPr>
+              <w:pStyle w:val="Compact"/>
+              <w:jc w:val="right"/>
+            </w:pPr>
+            <w:r>
+              <w:t xml:space="preserve">0.51</w:t>
+            </w:r>
+          </w:p>
+        </w:tc>
+        <w:tc>
+          <w:tcPr/>
+          <w:p>
+            <w:pPr>
+              <w:pStyle w:val="Compact"/>
+              <w:jc w:val="right"/>
+            </w:pPr>
+            <w:r>
+              <w:rPr>
+                <w:b/>
+                <w:bCs/>
+              </w:rPr>
+              <w:t xml:space="preserve">0.53</w:t>
+            </w:r>
+          </w:p>
+        </w:tc>
+      </w:tr>
+      <w:tr>
+        <w:tc>
+          <w:tcPr/>
+          <w:p>
+            <w:pPr>
+              <w:pStyle w:val="Compact"/>
+            </w:pPr>
+            <w:r>
+              <w:t xml:space="preserve">Onset (grounding)</w:t>
+            </w:r>
+          </w:p>
+        </w:tc>
+        <w:tc>
+          <w:tcPr/>
+          <w:p>
+            <w:pPr>
+              <w:pStyle w:val="Compact"/>
+              <w:jc w:val="right"/>
+            </w:pPr>
+            <w:r>
+              <w:t xml:space="preserve">0.15</w:t>
+            </w:r>
+          </w:p>
+        </w:tc>
+        <w:tc>
+          <w:tcPr/>
+          <w:p>
+            <w:pPr>
+              <w:pStyle w:val="Compact"/>
+              <w:jc w:val="right"/>
+            </w:pPr>
+            <w:r>
+              <w:t xml:space="preserve">0.24</w:t>
+            </w:r>
+          </w:p>
+        </w:tc>
+        <w:tc>
+          <w:tcPr/>
+          <w:p>
+            <w:pPr>
+              <w:pStyle w:val="Compact"/>
+              <w:jc w:val="right"/>
+            </w:pPr>
+            <w:r>
+              <w:rPr>
+                <w:b/>
+                <w:bCs/>
+              </w:rPr>
+              <w:t xml:space="preserve">0.24</w:t>
+            </w:r>
+          </w:p>
+        </w:tc>
+        <w:tc>
+          <w:tcPr/>
+          <w:p>
+            <w:pPr>
+              <w:pStyle w:val="Compact"/>
+              <w:jc w:val="right"/>
+            </w:pPr>
+            <w:r>
+              <w:t xml:space="preserve">0.24</w:t>
+            </w:r>
+          </w:p>
+        </w:tc>
+        <w:tc>
+          <w:tcPr/>
+          <w:p>
+            <w:pPr>
+              <w:pStyle w:val="Compact"/>
+              <w:jc w:val="right"/>
+            </w:pPr>
+            <w:r>
+              <w:rPr>
+                <w:b/>
+                <w:bCs/>
+              </w:rPr>
+              <w:t xml:space="preserve">0.24</w:t>
+            </w:r>
+          </w:p>
+        </w:tc>
+      </w:tr>
+      <w:tr>
+        <w:tc>
+          <w:tcPr/>
+          <w:p>
+            <w:pPr>
+              <w:pStyle w:val="Compact"/>
+            </w:pPr>
+            <w:r>
+              <w:t xml:space="preserve">Prolonged</w:t>
+            </w:r>
+          </w:p>
+        </w:tc>
+        <w:tc>
+          <w:tcPr/>
+          <w:p>
+            <w:pPr>
+              <w:pStyle w:val="Compact"/>
+              <w:jc w:val="right"/>
+            </w:pPr>
+            <w:r>
+              <w:t xml:space="preserve">0.84</w:t>
+            </w:r>
+          </w:p>
+        </w:tc>
+        <w:tc>
+          <w:tcPr/>
+          <w:p>
+            <w:pPr>
+              <w:pStyle w:val="Compact"/>
+              <w:jc w:val="right"/>
+            </w:pPr>
+            <w:r>
+              <w:t xml:space="preserve">0.85</w:t>
+            </w:r>
+          </w:p>
+        </w:tc>
+        <w:tc>
+          <w:tcPr/>
+          <w:p>
+            <w:pPr>
+              <w:pStyle w:val="Compact"/>
+              <w:jc w:val="right"/>
+            </w:pPr>
+            <w:r>
+              <w:rPr>
+                <w:b/>
+                <w:bCs/>
+              </w:rPr>
+              <w:t xml:space="preserve">0.85</w:t>
+            </w:r>
+          </w:p>
+        </w:tc>
+        <w:tc>
+          <w:tcPr/>
+          <w:p>
+            <w:pPr>
+              <w:pStyle w:val="Compact"/>
+              <w:jc w:val="right"/>
+            </w:pPr>
+            <w:r>
+              <w:t xml:space="preserve">0.54</w:t>
+            </w:r>
+          </w:p>
+        </w:tc>
+        <w:tc>
+          <w:tcPr/>
+          <w:p>
+            <w:pPr>
+              <w:pStyle w:val="Compact"/>
+              <w:jc w:val="right"/>
+            </w:pPr>
+            <w:r>
+              <w:rPr>
+                <w:b/>
+                <w:bCs/>
+              </w:rPr>
+              <w:t xml:space="preserve">0.54</w:t>
+            </w:r>
+          </w:p>
+        </w:tc>
+      </w:tr>
+      <w:tr>
+        <w:tc>
+          <w:tcPr/>
+          <w:p>
+            <w:pPr>
+              <w:pStyle w:val="Compact"/>
+            </w:pPr>
+            <w:r>
+              <w:t xml:space="preserve">Open-world</w:t>
+            </w:r>
+          </w:p>
+        </w:tc>
+        <w:tc>
+          <w:tcPr/>
+          <w:p>
+            <w:pPr>
+              <w:pStyle w:val="Compact"/>
+              <w:jc w:val="right"/>
+            </w:pPr>
+            <w:r>
+              <w:t xml:space="preserve">0.75</w:t>
+            </w:r>
+          </w:p>
+        </w:tc>
+        <w:tc>
+          <w:tcPr/>
+          <w:p>
+            <w:pPr>
+              <w:pStyle w:val="Compact"/>
+              <w:jc w:val="right"/>
+            </w:pPr>
+            <w:r>
+              <w:t xml:space="preserve">0.76</w:t>
             </w:r>
           </w:p>
         </w:tc>
@@ -4517,421 +5118,7 @@
               <w:jc w:val="right"/>
             </w:pPr>
             <w:r>
-              <w:t xml:space="preserve">0.60</w:t>
-            </w:r>
-          </w:p>
-        </w:tc>
-        <w:tc>
-          <w:tcPr/>
-          <w:p>
-            <w:pPr>
-              <w:pStyle w:val="Compact"/>
-              <w:jc w:val="right"/>
-            </w:pPr>
-            <w:r>
-              <w:rPr>
-                <w:b/>
-                <w:bCs/>
-              </w:rPr>
-              <w:t xml:space="preserve">0.71</w:t>
-            </w:r>
-          </w:p>
-        </w:tc>
-      </w:tr>
-      <w:tr>
-        <w:tc>
-          <w:tcPr/>
-          <w:p>
-            <w:pPr>
-              <w:pStyle w:val="Compact"/>
-            </w:pPr>
-            <w:r>
-              <w:t xml:space="preserve">Duration</w:t>
-            </w:r>
-          </w:p>
-        </w:tc>
-        <w:tc>
-          <w:tcPr/>
-          <w:p>
-            <w:pPr>
-              <w:pStyle w:val="Compact"/>
-              <w:jc w:val="right"/>
-            </w:pPr>
-            <w:r>
-              <w:t xml:space="preserve">0.29</w:t>
-            </w:r>
-          </w:p>
-        </w:tc>
-        <w:tc>
-          <w:tcPr/>
-          <w:p>
-            <w:pPr>
-              <w:pStyle w:val="Compact"/>
-              <w:jc w:val="right"/>
-            </w:pPr>
-            <w:r>
-              <w:rPr>
-                <w:b/>
-                <w:bCs/>
-              </w:rPr>
-              <w:t xml:space="preserve">0.44</w:t>
-            </w:r>
-          </w:p>
-        </w:tc>
-        <w:tc>
-          <w:tcPr/>
-          <w:p>
-            <w:pPr>
-              <w:pStyle w:val="Compact"/>
-              <w:jc w:val="right"/>
-            </w:pPr>
-            <w:r>
-              <w:t xml:space="preserve">0.26</w:t>
-            </w:r>
-          </w:p>
-        </w:tc>
-        <w:tc>
-          <w:tcPr/>
-          <w:p>
-            <w:pPr>
-              <w:pStyle w:val="Compact"/>
-              <w:jc w:val="right"/>
-            </w:pPr>
-            <w:r>
-              <w:rPr>
-                <w:b/>
-                <w:bCs/>
-              </w:rPr>
-              <w:t xml:space="preserve">0.37</w:t>
-            </w:r>
-          </w:p>
-        </w:tc>
-      </w:tr>
-      <w:tr>
-        <w:tc>
-          <w:tcPr/>
-          <w:p>
-            <w:pPr>
-              <w:pStyle w:val="Compact"/>
-            </w:pPr>
-            <w:r>
-              <w:t xml:space="preserve">Count</w:t>
-            </w:r>
-          </w:p>
-        </w:tc>
-        <w:tc>
-          <w:tcPr/>
-          <w:p>
-            <w:pPr>
-              <w:pStyle w:val="Compact"/>
-              <w:jc w:val="right"/>
-            </w:pPr>
-            <w:r>
-              <w:t xml:space="preserve">0.37</w:t>
-            </w:r>
-          </w:p>
-        </w:tc>
-        <w:tc>
-          <w:tcPr/>
-          <w:p>
-            <w:pPr>
-              <w:pStyle w:val="Compact"/>
-              <w:jc w:val="right"/>
-            </w:pPr>
-            <w:r>
-              <w:rPr>
-                <w:b/>
-                <w:bCs/>
-              </w:rPr>
-              <w:t xml:space="preserve">0.57</w:t>
-            </w:r>
-          </w:p>
-        </w:tc>
-        <w:tc>
-          <w:tcPr/>
-          <w:p>
-            <w:pPr>
-              <w:pStyle w:val="Compact"/>
-              <w:jc w:val="right"/>
-            </w:pPr>
-            <w:r>
-              <w:t xml:space="preserve">0.30</w:t>
-            </w:r>
-          </w:p>
-        </w:tc>
-        <w:tc>
-          <w:tcPr/>
-          <w:p>
-            <w:pPr>
-              <w:pStyle w:val="Compact"/>
-              <w:jc w:val="right"/>
-            </w:pPr>
-            <w:r>
-              <w:rPr>
-                <w:b/>
-                <w:bCs/>
-              </w:rPr>
-              <w:t xml:space="preserve">0.42</w:t>
-            </w:r>
-          </w:p>
-        </w:tc>
-      </w:tr>
-      <w:tr>
-        <w:tc>
-          <w:tcPr/>
-          <w:p>
-            <w:pPr>
-              <w:pStyle w:val="Compact"/>
-            </w:pPr>
-            <w:r>
-              <w:t xml:space="preserve">Comparison</w:t>
-            </w:r>
-          </w:p>
-        </w:tc>
-        <w:tc>
-          <w:tcPr/>
-          <w:p>
-            <w:pPr>
-              <w:pStyle w:val="Compact"/>
-              <w:jc w:val="right"/>
-            </w:pPr>
-            <w:r>
-              <w:t xml:space="preserve">0.79</w:t>
-            </w:r>
-          </w:p>
-        </w:tc>
-        <w:tc>
-          <w:tcPr/>
-          <w:p>
-            <w:pPr>
-              <w:pStyle w:val="Compact"/>
-              <w:jc w:val="right"/>
-            </w:pPr>
-            <w:r>
-              <w:rPr>
-                <w:b/>
-                <w:bCs/>
-              </w:rPr>
-              <w:t xml:space="preserve">0.90</w:t>
-            </w:r>
-          </w:p>
-        </w:tc>
-        <w:tc>
-          <w:tcPr/>
-          <w:p>
-            <w:pPr>
-              <w:pStyle w:val="Compact"/>
-              <w:jc w:val="right"/>
-            </w:pPr>
-            <w:r>
-              <w:t xml:space="preserve">0.41</w:t>
-            </w:r>
-          </w:p>
-        </w:tc>
-        <w:tc>
-          <w:tcPr/>
-          <w:p>
-            <w:pPr>
-              <w:pStyle w:val="Compact"/>
-              <w:jc w:val="right"/>
-            </w:pPr>
-            <w:r>
-              <w:rPr>
-                <w:b/>
-                <w:bCs/>
-              </w:rPr>
-              <w:t xml:space="preserve">0.51</w:t>
-            </w:r>
-          </w:p>
-        </w:tc>
-      </w:tr>
-      <w:tr>
-        <w:tc>
-          <w:tcPr/>
-          <w:p>
-            <w:pPr>
-              <w:pStyle w:val="Compact"/>
-            </w:pPr>
-            <w:r>
-              <w:t xml:space="preserve">Onset (grounding)</w:t>
-            </w:r>
-          </w:p>
-        </w:tc>
-        <w:tc>
-          <w:tcPr/>
-          <w:p>
-            <w:pPr>
-              <w:pStyle w:val="Compact"/>
-              <w:jc w:val="right"/>
-            </w:pPr>
-            <w:r>
-              <w:t xml:space="preserve">0.15</w:t>
-            </w:r>
-          </w:p>
-        </w:tc>
-        <w:tc>
-          <w:tcPr/>
-          <w:p>
-            <w:pPr>
-              <w:pStyle w:val="Compact"/>
-              <w:jc w:val="right"/>
-            </w:pPr>
-            <w:r>
-              <w:rPr>
-                <w:b/>
-                <w:bCs/>
-              </w:rPr>
-              <w:t xml:space="preserve">0.24</w:t>
-            </w:r>
-          </w:p>
-        </w:tc>
-        <w:tc>
-          <w:tcPr/>
-          <w:p>
-            <w:pPr>
-              <w:pStyle w:val="Compact"/>
-              <w:jc w:val="right"/>
-            </w:pPr>
-            <w:r>
-              <w:t xml:space="preserve">0.15</w:t>
-            </w:r>
-          </w:p>
-        </w:tc>
-        <w:tc>
-          <w:tcPr/>
-          <w:p>
-            <w:pPr>
-              <w:pStyle w:val="Compact"/>
-              <w:jc w:val="right"/>
-            </w:pPr>
-            <w:r>
-              <w:rPr>
-                <w:b/>
-                <w:bCs/>
-              </w:rPr>
-              <w:t xml:space="preserve">0.24</w:t>
-            </w:r>
-          </w:p>
-        </w:tc>
-      </w:tr>
-      <w:tr>
-        <w:tc>
-          <w:tcPr/>
-          <w:p>
-            <w:pPr>
-              <w:pStyle w:val="Compact"/>
-            </w:pPr>
-            <w:r>
-              <w:t xml:space="preserve">Prolonged</w:t>
-            </w:r>
-          </w:p>
-        </w:tc>
-        <w:tc>
-          <w:tcPr/>
-          <w:p>
-            <w:pPr>
-              <w:pStyle w:val="Compact"/>
-              <w:jc w:val="right"/>
-            </w:pPr>
-            <w:r>
-              <w:t xml:space="preserve">0.84</w:t>
-            </w:r>
-          </w:p>
-        </w:tc>
-        <w:tc>
-          <w:tcPr/>
-          <w:p>
-            <w:pPr>
-              <w:pStyle w:val="Compact"/>
-              <w:jc w:val="right"/>
-            </w:pPr>
-            <w:r>
-              <w:rPr>
-                <w:b/>
-                <w:bCs/>
-              </w:rPr>
-              <w:t xml:space="preserve">0.85</w:t>
-            </w:r>
-          </w:p>
-        </w:tc>
-        <w:tc>
-          <w:tcPr/>
-          <w:p>
-            <w:pPr>
-              <w:pStyle w:val="Compact"/>
-              <w:jc w:val="right"/>
-            </w:pPr>
-            <w:r>
-              <w:t xml:space="preserve">0.49</w:t>
-            </w:r>
-          </w:p>
-        </w:tc>
-        <w:tc>
-          <w:tcPr/>
-          <w:p>
-            <w:pPr>
-              <w:pStyle w:val="Compact"/>
-              <w:jc w:val="right"/>
-            </w:pPr>
-            <w:r>
-              <w:rPr>
-                <w:b/>
-                <w:bCs/>
-              </w:rPr>
-              <w:t xml:space="preserve">0.54</w:t>
-            </w:r>
-          </w:p>
-        </w:tc>
-      </w:tr>
-      <w:tr>
-        <w:tc>
-          <w:tcPr/>
-          <w:p>
-            <w:pPr>
-              <w:pStyle w:val="Compact"/>
-            </w:pPr>
-            <w:r>
-              <w:t xml:space="preserve">Open-world</w:t>
-            </w:r>
-          </w:p>
-        </w:tc>
-        <w:tc>
-          <w:tcPr/>
-          <w:p>
-            <w:pPr>
-              <w:pStyle w:val="Compact"/>
-              <w:jc w:val="right"/>
-            </w:pPr>
-            <w:r>
-              <w:t xml:space="preserve">0.75</w:t>
-            </w:r>
-          </w:p>
-        </w:tc>
-        <w:tc>
-          <w:tcPr/>
-          <w:p>
-            <w:pPr>
-              <w:pStyle w:val="Compact"/>
-              <w:jc w:val="right"/>
-            </w:pPr>
-            <w:r>
-              <w:rPr>
-                <w:b/>
-                <w:bCs/>
-              </w:rPr>
-              <w:t xml:space="preserve">0.76</w:t>
-            </w:r>
-          </w:p>
-        </w:tc>
-        <w:tc>
-          <w:tcPr/>
-          <w:p>
-            <w:pPr>
-              <w:pStyle w:val="Compact"/>
-              <w:jc w:val="right"/>
-            </w:pPr>
-            <w:r>
-              <w:t xml:space="preserve">0.40</w:t>
+              <w:t xml:space="preserve">0.46</w:t>
             </w:r>
           </w:p>
         </w:tc>
@@ -4988,23 +5175,35 @@
               <w:jc w:val="right"/>
             </w:pPr>
             <w:r>
+              <w:t xml:space="preserve">0.636</w:t>
+            </w:r>
+          </w:p>
+        </w:tc>
+        <w:tc>
+          <w:tcPr/>
+          <w:p>
+            <w:pPr>
+              <w:pStyle w:val="Compact"/>
+              <w:jc w:val="right"/>
+            </w:pPr>
+            <w:r>
               <w:rPr>
                 <w:b/>
                 <w:bCs/>
               </w:rPr>
-              <w:t xml:space="preserve">0.636</w:t>
-            </w:r>
-          </w:p>
-        </w:tc>
-        <w:tc>
-          <w:tcPr/>
-          <w:p>
-            <w:pPr>
-              <w:pStyle w:val="Compact"/>
-              <w:jc w:val="right"/>
-            </w:pPr>
-            <w:r>
-              <w:t xml:space="preserve">0.381</w:t>
+              <w:t xml:space="preserve">0.612</w:t>
+            </w:r>
+          </w:p>
+        </w:tc>
+        <w:tc>
+          <w:tcPr/>
+          <w:p>
+            <w:pPr>
+              <w:pStyle w:val="Compact"/>
+              <w:jc w:val="right"/>
+            </w:pPr>
+            <w:r>
+              <w:t xml:space="preserve">0.475</w:t>
             </w:r>
           </w:p>
         </w:tc>
@@ -5020,7 +5219,7 @@
                 <w:b/>
                 <w:bCs/>
               </w:rPr>
-              <w:t xml:space="preserve">0.475</w:t>
+              <w:t xml:space="preserve">0.462</w:t>
             </w:r>
           </w:p>
         </w:tc>
@@ -5041,22 +5240,97 @@
           <w:b/>
           <w:bCs/>
         </w:rPr>
-        <w:t xml:space="preserve">63.6% overall QA accuracy and 47.5% with grounded evidence</w:t>
-      </w:r>
-      <w:r>
-        <w:t xml:space="preserve">. Accuracy is high</w:t>
-      </w:r>
-      <w:r>
-        <w:t xml:space="preserve"> </w:t>
-      </w:r>
-      <w:r>
-        <w:t xml:space="preserve">where the answer depends on the overall picture (comparison 0.90, prolonged 0.85, verification</w:t>
-      </w:r>
-      <w:r>
-        <w:t xml:space="preserve"> </w:t>
-      </w:r>
-      <w:r>
-        <w:t xml:space="preserve">0.76, open-world 0.76) and lower where exact boundaries matter (onset 0.24, duration 0.44). The gap</w:t>
+        <w:t xml:space="preserve">61.2% overall QA accuracy and 46.2% with grounded evidence</w:t>
+      </w:r>
+      <w:r>
+        <w:t xml:space="preserve"> </w:t>
+      </w:r>
+      <w:r>
+        <w:t xml:space="preserve">for the full system.</w:t>
+      </w:r>
+      <w:r>
+        <w:t xml:space="preserve"> </w:t>
+      </w:r>
+      <w:r>
+        <w:t xml:space="preserve">With the rule parser the same sensor pipeline reaches 63.6% and 47.5%; the difference of 2.4 points</w:t>
+      </w:r>
+      <w:r>
+        <w:t xml:space="preserve"> </w:t>
+      </w:r>
+      <w:r>
+        <w:t xml:space="preserve">is the cost of reading questions with a language model instead of hand-tuned patterns, and is</w:t>
+      </w:r>
+      <w:r>
+        <w:t xml:space="preserve"> </w:t>
+      </w:r>
+      <w:r>
+        <w:t xml:space="preserve">concentrated in verification and comparison, where the model sometimes reads</w:t>
+      </w:r>
+      <w:r>
+        <w:t xml:space="preserve"> </w:t>
+      </w:r>
+      <w:r>
+        <w:t xml:space="preserve">“Was the user X</w:t>
+      </w:r>
+      <w:r>
+        <w:t xml:space="preserve"> </w:t>
+      </w:r>
+      <w:r>
+        <w:t xml:space="preserve">between a and b?”</w:t>
+      </w:r>
+      <w:r>
+        <w:t xml:space="preserve"> </w:t>
+      </w:r>
+      <w:r>
+        <w:t xml:space="preserve">as an identification (21 of 150 verification questions) and merges the two</w:t>
+      </w:r>
+      <w:r>
+        <w:t xml:space="preserve"> </w:t>
+      </w:r>
+      <w:r>
+        <w:t xml:space="preserve">activities of a comparison. A first run with a</w:t>
+      </w:r>
+      <w:r>
+        <w:t xml:space="preserve"> </w:t>
+      </w:r>
+      <w:r>
+        <w:t xml:space="preserve">shorter prompt scored 50.5%: the model read</w:t>
+      </w:r>
+      <w:r>
+        <w:t xml:space="preserve"> </w:t>
+      </w:r>
+      <w:r>
+        <w:t xml:space="preserve">“is this consistent with commuting?”</w:t>
+      </w:r>
+      <w:r>
+        <w:t xml:space="preserve"> </w:t>
+      </w:r>
+      <w:r>
+        <w:t xml:space="preserve">as yes/no</w:t>
+      </w:r>
+      <w:r>
+        <w:t xml:space="preserve"> </w:t>
+      </w:r>
+      <w:r>
+        <w:t xml:space="preserve">(open-world 0.11). We added general instructions and three differently worded examples for such</w:t>
+      </w:r>
+      <w:r>
+        <w:t xml:space="preserve"> </w:t>
+      </w:r>
+      <w:r>
+        <w:t xml:space="preserve">phrasings and re-ran once; we report that run, and note that the change was motivated by the</w:t>
+      </w:r>
+      <w:r>
+        <w:t xml:space="preserve"> </w:t>
+      </w:r>
+      <w:r>
+        <w:t xml:space="preserve">evaluation. Accuracy is high where the answer depends on the overall picture (comparison 0.82,</w:t>
+      </w:r>
+      <w:r>
+        <w:t xml:space="preserve"> </w:t>
+      </w:r>
+      <w:r>
+        <w:t xml:space="preserve">prolonged 0.85, open-world 0.76) and lower where exact boundaries matter (onset 0.24, duration 0.42). The gap</w:t>
       </w:r>
       <w:r>
         <w:t xml:space="preserve"> </w:t>
@@ -5083,19 +5357,19 @@
         <w:t xml:space="preserve"> </w:t>
       </w:r>
       <w:r>
-        <w:t xml:space="preserve">verdict can be right while the cited intervals overlap the reference only partly. Temporal decoding</w:t>
-      </w:r>
-      <w:r>
-        <w:t xml:space="preserve"> </w:t>
-      </w:r>
-      <w:r>
-        <w:t xml:space="preserve">improved every type and cut the mean duration error from 1,600 s to 1,056 s; it did not change the</w:t>
-      </w:r>
-      <w:r>
-        <w:t xml:space="preserve"> </w:t>
-      </w:r>
-      <w:r>
-        <w:t xml:space="preserve">classifier at all.</w:t>
+        <w:t xml:space="preserve">verdict can be right while the cited intervals overlap the reference only partly. With the rule</w:t>
+      </w:r>
+      <w:r>
+        <w:t xml:space="preserve"> </w:t>
+      </w:r>
+      <w:r>
+        <w:t xml:space="preserve">parser, temporal decoding improved every type and cut the mean duration error from 1,600 s to</w:t>
+      </w:r>
+      <w:r>
+        <w:t xml:space="preserve"> </w:t>
+      </w:r>
+      <w:r>
+        <w:t xml:space="preserve">1,056 s; it did not change the classifier at all.</w:t>
       </w:r>
     </w:p>
     <w:p>
@@ -5103,7 +5377,7 @@
         <w:pStyle w:val="TableCaption"/>
       </w:pPr>
       <w:r>
-        <w:t xml:space="preserve">Answer-level metrics beside plain accuracy (same 767 questions).</w:t>
+        <w:t xml:space="preserve">Answer-level metrics (same 767 questions). P/R: precision/recall. MAPE over the 74 non-zero references. A question routed to another operation counts as a wrong label.</w:t>
       </w:r>
     </w:p>
     <w:tbl>
@@ -5112,12 +5386,13 @@
         <w:tblW w:type="pct" w:w="5000"/>
         <w:tblLayout w:type="fixed"/>
         <w:tblLook w:firstRow="1" w:lastRow="0" w:firstColumn="0" w:lastColumn="0" w:noHBand="0" w:noVBand="0" w:val="0020"/>
-        <w:tblCaption w:val="Answer-level metrics beside plain accuracy (same 767 questions)."/>
+        <w:tblCaption w:val="Answer-level metrics (same 767 questions). P/R: precision/recall. MAPE over the 74 non-zero references. A question routed to another operation counts as a wrong label."/>
       </w:tblPr>
       <w:tblGrid>
-        <w:gridCol w:w="2640"/>
-        <w:gridCol w:w="2640"/>
-        <w:gridCol w:w="2640"/>
+        <w:gridCol w:w="1980"/>
+        <w:gridCol w:w="1980"/>
+        <w:gridCol w:w="1980"/>
+        <w:gridCol w:w="1980"/>
       </w:tblGrid>
       <w:tr>
         <w:trPr>
@@ -5152,7 +5427,22 @@
               <w:pStyle w:val="Compact"/>
             </w:pPr>
             <w:r>
-              <w:t xml:space="preserve">Value</w:t>
+              <w:t xml:space="preserve">Rules</w:t>
+            </w:r>
+          </w:p>
+        </w:tc>
+        <w:tc>
+          <w:tcPr/>
+          <w:p>
+            <w:pPr>
+              <w:pStyle w:val="Compact"/>
+            </w:pPr>
+            <w:r>
+              <w:rPr>
+                <w:b/>
+                <w:bCs/>
+              </w:rPr>
+              <w:t xml:space="preserve">SLM system</w:t>
             </w:r>
           </w:p>
         </w:tc>
@@ -5176,7 +5466,7 @@
               <w:pStyle w:val="Compact"/>
             </w:pPr>
             <w:r>
-              <w:t xml:space="preserve">precision / recall / F1 on</w:t>
+              <w:t xml:space="preserve">P / R / F1 on</w:t>
             </w:r>
             <w:r>
               <w:t xml:space="preserve"> </w:t>
@@ -5197,6 +5487,21 @@
             </w:pPr>
             <w:r>
               <w:t xml:space="preserve">0.88 / 0.60 / 0.71; 0.92</w:t>
+            </w:r>
+          </w:p>
+        </w:tc>
+        <w:tc>
+          <w:tcPr/>
+          <w:p>
+            <w:pPr>
+              <w:pStyle w:val="Compact"/>
+            </w:pPr>
+            <w:r>
+              <w:rPr>
+                <w:b/>
+                <w:bCs/>
+              </w:rPr>
+              <w:t xml:space="preserve">0.85 / 0.73 / 0.79; 0.87</w:t>
             </w:r>
           </w:p>
         </w:tc>
@@ -5220,7 +5525,7 @@
               <w:pStyle w:val="Compact"/>
             </w:pPr>
             <w:r>
-              <w:t xml:space="preserve">precision / recall / F1 on</w:t>
+              <w:t xml:space="preserve">P / R / F1 on</w:t>
             </w:r>
             <w:r>
               <w:t xml:space="preserve"> </w:t>
@@ -5240,6 +5545,21 @@
               <w:pStyle w:val="Compact"/>
             </w:pPr>
             <w:r>
+              <w:t xml:space="preserve">0.70 / 0.92 / 0.79; 0.82</w:t>
+            </w:r>
+          </w:p>
+        </w:tc>
+        <w:tc>
+          <w:tcPr/>
+          <w:p>
+            <w:pPr>
+              <w:pStyle w:val="Compact"/>
+            </w:pPr>
+            <w:r>
+              <w:rPr>
+                <w:b/>
+                <w:bCs/>
+              </w:rPr>
               <w:t xml:space="preserve">0.70 / 0.92 / 0.79; 0.82</w:t>
             </w:r>
           </w:p>
@@ -5253,27 +5573,18 @@
               <w:pStyle w:val="Compact"/>
             </w:pPr>
             <w:r>
-              <w:t xml:space="preserve">Onset detected (n = 74, all present)</w:t>
-            </w:r>
-          </w:p>
-        </w:tc>
-        <w:tc>
-          <w:tcPr/>
-          <w:p>
-            <w:pPr>
-              <w:pStyle w:val="Compact"/>
-            </w:pPr>
-            <w:r>
-              <w:t xml:space="preserve">recall (</w:t>
-            </w:r>
-            <w:r>
-              <w:t xml:space="preserve">“yes”</w:t>
-            </w:r>
-            <w:r>
-              <w:t xml:space="preserve"> </w:t>
-            </w:r>
-            <w:r>
-              <w:t xml:space="preserve">when the activity starts)</w:t>
+              <w:t xml:space="preserve">Onset detected (n = 74)</w:t>
+            </w:r>
+          </w:p>
+        </w:tc>
+        <w:tc>
+          <w:tcPr/>
+          <w:p>
+            <w:pPr>
+              <w:pStyle w:val="Compact"/>
+            </w:pPr>
+            <w:r>
+              <w:t xml:space="preserve">recall</w:t>
             </w:r>
           </w:p>
         </w:tc>
@@ -5285,6 +5596,21 @@
             </w:pPr>
             <w:r>
               <w:t xml:space="preserve">0.82</w:t>
+            </w:r>
+          </w:p>
+        </w:tc>
+        <w:tc>
+          <w:tcPr/>
+          <w:p>
+            <w:pPr>
+              <w:pStyle w:val="Compact"/>
+            </w:pPr>
+            <w:r>
+              <w:rPr>
+                <w:b/>
+                <w:bCs/>
+              </w:rPr>
+              <w:t xml:space="preserve">0.95</w:t>
             </w:r>
           </w:p>
         </w:tc>
@@ -5323,6 +5649,21 @@
             </w:r>
           </w:p>
         </w:tc>
+        <w:tc>
+          <w:tcPr/>
+          <w:p>
+            <w:pPr>
+              <w:pStyle w:val="Compact"/>
+            </w:pPr>
+            <w:r>
+              <w:rPr>
+                <w:b/>
+                <w:bCs/>
+              </w:rPr>
+              <w:t xml:space="preserve">0.46 / 0.44</w:t>
+            </w:r>
+          </w:p>
+        </w:tc>
       </w:tr>
       <w:tr>
         <w:tc>
@@ -5358,6 +5699,21 @@
             </w:r>
           </w:p>
         </w:tc>
+        <w:tc>
+          <w:tcPr/>
+          <w:p>
+            <w:pPr>
+              <w:pStyle w:val="Compact"/>
+            </w:pPr>
+            <w:r>
+              <w:rPr>
+                <w:b/>
+                <w:bCs/>
+              </w:rPr>
+              <w:t xml:space="preserve">0.70 / 0.74</w:t>
+            </w:r>
+          </w:p>
+        </w:tc>
       </w:tr>
       <w:tr>
         <w:tc>
@@ -5393,6 +5749,21 @@
             </w:r>
           </w:p>
         </w:tc>
+        <w:tc>
+          <w:tcPr/>
+          <w:p>
+            <w:pPr>
+              <w:pStyle w:val="Compact"/>
+            </w:pPr>
+            <w:r>
+              <w:rPr>
+                <w:b/>
+                <w:bCs/>
+              </w:rPr>
+              <w:t xml:space="preserve">0.67 / 0.69</w:t>
+            </w:r>
+          </w:p>
+        </w:tc>
       </w:tr>
       <w:tr>
         <w:tc>
@@ -5413,7 +5784,7 @@
               <w:pStyle w:val="Compact"/>
             </w:pPr>
             <w:r>
-              <w:t xml:space="preserve">mean / median absolute error; MAPE (74 non-zero refs)</w:t>
+              <w:t xml:space="preserve">mean / median abs. error; MAPE</w:t>
             </w:r>
           </w:p>
         </w:tc>
@@ -5425,6 +5796,21 @@
             </w:pPr>
             <w:r>
               <w:t xml:space="preserve">1,056 s / 163 s; 95%</w:t>
+            </w:r>
+          </w:p>
+        </w:tc>
+        <w:tc>
+          <w:tcPr/>
+          <w:p>
+            <w:pPr>
+              <w:pStyle w:val="Compact"/>
+            </w:pPr>
+            <w:r>
+              <w:rPr>
+                <w:b/>
+                <w:bCs/>
+              </w:rPr>
+              <w:t xml:space="preserve">1,107 s / 273 s; 255%</w:t>
             </w:r>
           </w:p>
         </w:tc>
@@ -5448,17 +5834,32 @@
               <w:pStyle w:val="Compact"/>
             </w:pPr>
             <w:r>
-              <w:t xml:space="preserve">mean / median absolute error</w:t>
-            </w:r>
-          </w:p>
-        </w:tc>
-        <w:tc>
-          <w:tcPr/>
-          <w:p>
-            <w:pPr>
-              <w:pStyle w:val="Compact"/>
-            </w:pPr>
-            <w:r>
+              <w:t xml:space="preserve">mean / median abs. error</w:t>
+            </w:r>
+          </w:p>
+        </w:tc>
+        <w:tc>
+          <w:tcPr/>
+          <w:p>
+            <w:pPr>
+              <w:pStyle w:val="Compact"/>
+            </w:pPr>
+            <w:r>
+              <w:t xml:space="preserve">4.9 / 1.0 bouts</w:t>
+            </w:r>
+          </w:p>
+        </w:tc>
+        <w:tc>
+          <w:tcPr/>
+          <w:p>
+            <w:pPr>
+              <w:pStyle w:val="Compact"/>
+            </w:pPr>
+            <w:r>
+              <w:rPr>
+                <w:b/>
+                <w:bCs/>
+              </w:rPr>
               <w:t xml:space="preserve">4.9 / 1.0 bouts</w:t>
             </w:r>
           </w:p>
@@ -5498,6 +5899,21 @@
             </w:r>
           </w:p>
         </w:tc>
+        <w:tc>
+          <w:tcPr/>
+          <w:p>
+            <w:pPr>
+              <w:pStyle w:val="Compact"/>
+            </w:pPr>
+            <w:r>
+              <w:rPr>
+                <w:b/>
+                <w:bCs/>
+              </w:rPr>
+              <w:t xml:space="preserve">0.40</w:t>
+            </w:r>
+          </w:p>
+        </w:tc>
       </w:tr>
     </w:tbl>
     <w:p>
@@ -5505,7 +5921,7 @@
         <w:pStyle w:val="BodyText"/>
       </w:pPr>
       <w:r>
-        <w:t xml:space="preserve">These metrics expose two biases that accuracy hides. Verification leans towards</w:t>
+        <w:t xml:space="preserve">These metrics expose biases that accuracy hides. With the rule parser, verification leans towards</w:t>
       </w:r>
       <w:r>
         <w:t xml:space="preserve"> </w:t>
@@ -5517,43 +5933,55 @@
         <w:t xml:space="preserve"> </w:t>
       </w:r>
       <w:r>
-        <w:t xml:space="preserve">(specificity</w:t>
-      </w:r>
-      <w:r>
-        <w:t xml:space="preserve"> </w:t>
-      </w:r>
-      <w:r>
-        <w:t xml:space="preserve">0.92, recall 0.60): when the asked-about activity is present, the system misses it in 40% of cases,</w:t>
-      </w:r>
-      <w:r>
-        <w:t xml:space="preserve"> </w:t>
-      </w:r>
-      <w:r>
-        <w:t xml:space="preserve">mostly under-recognised postures. Prolonged questions lean the other way (recall 0.92, precision</w:t>
-      </w:r>
-      <w:r>
-        <w:t xml:space="preserve"> </w:t>
-      </w:r>
-      <w:r>
-        <w:t xml:space="preserve">0.70): a long still stretch is sometimes over-merged into one bout. The numeric errors are</w:t>
-      </w:r>
-      <w:r>
-        <w:t xml:space="preserve"> </w:t>
-      </w:r>
-      <w:r>
-        <w:t xml:space="preserve">heavy-tailed: the typical duration error is 163 s and the typical count error one bout, but a few long</w:t>
-      </w:r>
-      <w:r>
-        <w:t xml:space="preserve"> </w:t>
-      </w:r>
-      <w:r>
-        <w:t xml:space="preserve">recordings in which a whole posture is mislabelled (sitting as lying) push the mean to 1,056 s.</w:t>
-      </w:r>
-      <w:r>
-        <w:t xml:space="preserve"> </w:t>
-      </w:r>
-      <w:r>
-        <w:t xml:space="preserve">MAPE is inflated by references of a few minutes, where any error is a large percentage.</w:t>
+        <w:t xml:space="preserve">(specificity 0.92, recall 0.60): when the asked-about activity is present, it is missed in 40%</w:t>
+      </w:r>
+      <w:r>
+        <w:t xml:space="preserve"> </w:t>
+      </w:r>
+      <w:r>
+        <w:t xml:space="preserve">of cases, mostly under-recognised postures. Prolonged questions lean the other way (recall 0.92,</w:t>
+      </w:r>
+      <w:r>
+        <w:t xml:space="preserve"> </w:t>
+      </w:r>
+      <w:r>
+        <w:t xml:space="preserve">precision 0.70): a long still stretch is sometimes over-merged into one bout. These two follow the</w:t>
+      </w:r>
+      <w:r>
+        <w:t xml:space="preserve"> </w:t>
+      </w:r>
+      <w:r>
+        <w:t xml:space="preserve">sensor pipeline and are almost unchanged with the language model. The numeric errors are</w:t>
+      </w:r>
+      <w:r>
+        <w:t xml:space="preserve"> </w:t>
+      </w:r>
+      <w:r>
+        <w:t xml:space="preserve">heavy-tailed: with the rule parser the typical duration error is 163 s and the typical count error</w:t>
+      </w:r>
+      <w:r>
+        <w:t xml:space="preserve"> </w:t>
+      </w:r>
+      <w:r>
+        <w:t xml:space="preserve">one bout, but a few long recordings in which a whole posture is mislabelled (sitting as lying) push</w:t>
+      </w:r>
+      <w:r>
+        <w:t xml:space="preserve"> </w:t>
+      </w:r>
+      <w:r>
+        <w:t xml:space="preserve">the mean to 1,056 s. With the language model the median duration error rises to 273 s and MAPE to</w:t>
+      </w:r>
+      <w:r>
+        <w:t xml:space="preserve"> </w:t>
+      </w:r>
+      <w:r>
+        <w:t xml:space="preserve">255%, because a misread time range makes the system measure the wrong stretch of the recording;</w:t>
+      </w:r>
+      <w:r>
+        <w:t xml:space="preserve"> </w:t>
+      </w:r>
+      <w:r>
+        <w:t xml:space="preserve">MAPE is in any case inflated by references of a few minutes.</w:t>
       </w:r>
     </w:p>
     <w:bookmarkEnd w:id="37"/>
@@ -5573,7 +6001,7 @@
       <w:r>
         <w:drawing>
           <wp:inline>
-            <wp:extent cx="4267200" cy="1706880"/>
+            <wp:extent cx="3093720" cy="1237488"/>
             <wp:effectExtent b="0" l="0" r="0" t="0"/>
             <wp:docPr descr="Figure 3. Left: share of duration answers accepted as the relative-error tolerance grows. Right: share of cited intervals accepted as the IoU threshold grows." title="" id="39" name="Picture"/>
             <a:graphic>
@@ -5594,7 +6022,7 @@
                   <pic:spPr bwMode="auto">
                     <a:xfrm>
                       <a:off x="0" y="0"/>
-                      <a:ext cx="4267200" cy="1706880"/>
+                      <a:ext cx="3093720" cy="1237488"/>
                     </a:xfrm>
                     <a:prstGeom prst="rect">
                       <a:avLst/>
@@ -5626,7 +6054,13 @@
         <w:pStyle w:val="BodyText"/>
       </w:pPr>
       <w:r>
-        <w:t xml:space="preserve">Figure 3 shows whether misses are near or wild. Duration acceptance grows steadily with the</w:t>
+        <w:t xml:space="preserve">Sections 5.3 and 5.4 use the rule parser, so that they measure the sensor pipeline alone. Figure 3</w:t>
+      </w:r>
+      <w:r>
+        <w:t xml:space="preserve"> </w:t>
+      </w:r>
+      <w:r>
+        <w:t xml:space="preserve">shows whether misses are near or wild. Duration acceptance grows steadily with the</w:t>
       </w:r>
       <w:r>
         <w:t xml:space="preserve"> </w:t>
@@ -5676,7 +6110,7 @@
       <w:r>
         <w:drawing>
           <wp:inline>
-            <wp:extent cx="4533900" cy="1435735"/>
+            <wp:extent cx="3307080" cy="1047242"/>
             <wp:effectExtent b="0" l="0" r="0" t="0"/>
             <wp:docPr descr="Figure 5. Overall QA accuracy on a fixed set of 10 recordings as the input is degraded." title="" id="43" name="Picture"/>
             <a:graphic>
@@ -5697,7 +6131,7 @@
                   <pic:spPr bwMode="auto">
                     <a:xfrm>
                       <a:off x="0" y="0"/>
-                      <a:ext cx="4533900" cy="1435735"/>
+                      <a:ext cx="3307080" cy="1047242"/>
                     </a:xfrm>
                     <a:prstGeom prst="rect">
                       <a:avLst/>
@@ -5885,13 +6319,7 @@
         <w:t xml:space="preserve"> </w:t>
       </w:r>
       <w:r>
-        <w:t xml:space="preserve">Typical phone accelerometer noise is a few milli-g, so the collapse lies outside realistic</w:t>
-      </w:r>
-      <w:r>
-        <w:t xml:space="preserve"> </w:t>
-      </w:r>
-      <w:r>
-        <w:t xml:space="preserve">operating conditions, but it identifies noise-augmented training as the next robustness step.</w:t>
+        <w:t xml:space="preserve">Typical phone noise is a few milli-g, so the collapse lies outside realistic conditions.</w:t>
       </w:r>
     </w:p>
     <w:bookmarkEnd w:id="45"/>
@@ -5909,21 +6337,34 @@
         <w:pStyle w:val="TableCaption"/>
       </w:pPr>
       <w:r>
-        <w:t xml:space="preserve">Intent accuracy (operation, activities and time range all correct) on the hand-written sets. CPU, single process. Qwen2.5-1.5B (≈6 GB in fp32) was also tried but did not fit in the 8 GB of the target laptop: it swapped and had not finished after 2.5 h, so it is not reported.</w:t>
+        <w:t xml:space="preserve">Intent accuracy (operation, activities and time range all correct) on the hand-written sets. Apple M2 laptop. In the</w:t>
+      </w:r>
+      <w:r>
+        <w:t xml:space="preserve"> </w:t>
+      </w:r>
+      <w:r>
+        <w:t xml:space="preserve">“operation and activities only”</w:t>
+      </w:r>
+      <w:r>
+        <w:t xml:space="preserve"> </w:t>
+      </w:r>
+      <w:r>
+        <w:t xml:space="preserve">rows the time range came from the rule extractor; in the last row the model extracts everything. Qwen2.5-1.5B in fp32 (≈6 GB) did not fit in 8 GB of memory.</w:t>
       </w:r>
     </w:p>
     <w:tbl>
       <w:tblPr>
         <w:tblStyle w:val="Table"/>
-        <w:tblW w:type="auto" w:w="0"/>
+        <w:tblW w:type="pct" w:w="5000"/>
+        <w:tblLayout w:type="fixed"/>
         <w:tblLook w:firstRow="1" w:lastRow="0" w:firstColumn="0" w:lastColumn="0" w:noHBand="0" w:noVBand="0" w:val="0020"/>
-        <w:tblCaption w:val="Intent accuracy (operation, activities and time range all correct) on the hand-written sets. CPU, single process. Qwen2.5-1.5B (≈6 GB in fp32) was also tried but did not fit in the 8 GB of the target laptop: it swapped and had not finished after 2.5 h, so it is not reported."/>
+        <w:tblCaption w:val="Intent accuracy (operation, activities and time range all correct) on the hand-written sets. Apple M2 laptop. In the “operation and activities only” rows the time range came from the rule extractor; in the last row the model extracts everything. Qwen2.5-1.5B in fp32 (≈6 GB) did not fit in 8 GB of memory."/>
       </w:tblPr>
       <w:tblGrid>
-        <w:gridCol w:w="1980"/>
-        <w:gridCol w:w="1980"/>
-        <w:gridCol w:w="1980"/>
-        <w:gridCol w:w="1980"/>
+        <w:gridCol w:w="1584"/>
+        <w:gridCol w:w="2112"/>
+        <w:gridCol w:w="2112"/>
+        <w:gridCol w:w="2112"/>
       </w:tblGrid>
       <w:tr>
         <w:trPr>
@@ -6034,11 +6475,207 @@
               <w:pStyle w:val="Compact"/>
             </w:pPr>
             <w:r>
+              <w:t xml:space="preserve">Rules, after hardening (baseline)</w:t>
+            </w:r>
+          </w:p>
+        </w:tc>
+        <w:tc>
+          <w:tcPr/>
+          <w:p>
+            <w:pPr>
+              <w:pStyle w:val="Compact"/>
+              <w:jc w:val="right"/>
+            </w:pPr>
+            <w:r>
+              <w:t xml:space="preserve">1.00</w:t>
+            </w:r>
+          </w:p>
+        </w:tc>
+        <w:tc>
+          <w:tcPr/>
+          <w:p>
+            <w:pPr>
+              <w:pStyle w:val="Compact"/>
+              <w:jc w:val="right"/>
+            </w:pPr>
+            <w:r>
+              <w:t xml:space="preserve">0.96</w:t>
+            </w:r>
+          </w:p>
+        </w:tc>
+        <w:tc>
+          <w:tcPr/>
+          <w:p>
+            <w:pPr>
+              <w:pStyle w:val="Compact"/>
+              <w:jc w:val="right"/>
+            </w:pPr>
+            <w:r>
+              <w:t xml:space="preserve">0.3 ms</w:t>
+            </w:r>
+          </w:p>
+        </w:tc>
+      </w:tr>
+      <w:tr>
+        <w:tc>
+          <w:tcPr/>
+          <w:p>
+            <w:pPr>
+              <w:pStyle w:val="Compact"/>
+            </w:pPr>
+            <w:r>
+              <w:t xml:space="preserve">Qwen2.5-0.5B-Instruct, fp32, transformers, operation and activities only</w:t>
+            </w:r>
+          </w:p>
+        </w:tc>
+        <w:tc>
+          <w:tcPr/>
+          <w:p>
+            <w:pPr>
+              <w:pStyle w:val="Compact"/>
+              <w:jc w:val="right"/>
+            </w:pPr>
+            <w:r>
+              <w:t xml:space="preserve">0.62</w:t>
+            </w:r>
+          </w:p>
+        </w:tc>
+        <w:tc>
+          <w:tcPr/>
+          <w:p>
+            <w:pPr>
+              <w:pStyle w:val="Compact"/>
+              <w:jc w:val="right"/>
+            </w:pPr>
+            <w:r>
+              <w:t xml:space="preserve">0.58</w:t>
+            </w:r>
+          </w:p>
+        </w:tc>
+        <w:tc>
+          <w:tcPr/>
+          <w:p>
+            <w:pPr>
+              <w:pStyle w:val="Compact"/>
+              <w:jc w:val="right"/>
+            </w:pPr>
+            <w:r>
+              <w:t xml:space="preserve">1.6–1.9 s</w:t>
+            </w:r>
+          </w:p>
+        </w:tc>
+      </w:tr>
+      <w:tr>
+        <w:tc>
+          <w:tcPr/>
+          <w:p>
+            <w:pPr>
+              <w:pStyle w:val="Compact"/>
+            </w:pPr>
+            <w:r>
+              <w:t xml:space="preserve">Qwen3-0.6B, 4-bit, llama.cpp, operation and activities only</w:t>
+            </w:r>
+          </w:p>
+        </w:tc>
+        <w:tc>
+          <w:tcPr/>
+          <w:p>
+            <w:pPr>
+              <w:pStyle w:val="Compact"/>
+              <w:jc w:val="right"/>
+            </w:pPr>
+            <w:r>
+              <w:t xml:space="preserve">0.64</w:t>
+            </w:r>
+          </w:p>
+        </w:tc>
+        <w:tc>
+          <w:tcPr/>
+          <w:p>
+            <w:pPr>
+              <w:pStyle w:val="Compact"/>
+              <w:jc w:val="right"/>
+            </w:pPr>
+            <w:r>
+              <w:t xml:space="preserve">0.54</w:t>
+            </w:r>
+          </w:p>
+        </w:tc>
+        <w:tc>
+          <w:tcPr/>
+          <w:p>
+            <w:pPr>
+              <w:pStyle w:val="Compact"/>
+              <w:jc w:val="right"/>
+            </w:pPr>
+            <w:r>
+              <w:t xml:space="preserve">0.4 s</w:t>
+            </w:r>
+          </w:p>
+        </w:tc>
+      </w:tr>
+      <w:tr>
+        <w:tc>
+          <w:tcPr/>
+          <w:p>
+            <w:pPr>
+              <w:pStyle w:val="Compact"/>
+            </w:pPr>
+            <w:r>
+              <w:t xml:space="preserve">Qwen3-1.7B, 4-bit, llama.cpp, operation and activities only</w:t>
+            </w:r>
+          </w:p>
+        </w:tc>
+        <w:tc>
+          <w:tcPr/>
+          <w:p>
+            <w:pPr>
+              <w:pStyle w:val="Compact"/>
+              <w:jc w:val="right"/>
+            </w:pPr>
+            <w:r>
+              <w:t xml:space="preserve">0.73</w:t>
+            </w:r>
+          </w:p>
+        </w:tc>
+        <w:tc>
+          <w:tcPr/>
+          <w:p>
+            <w:pPr>
+              <w:pStyle w:val="Compact"/>
+              <w:jc w:val="right"/>
+            </w:pPr>
+            <w:r>
+              <w:t xml:space="preserve">0.76</w:t>
+            </w:r>
+          </w:p>
+        </w:tc>
+        <w:tc>
+          <w:tcPr/>
+          <w:p>
+            <w:pPr>
+              <w:pStyle w:val="Compact"/>
+              <w:jc w:val="right"/>
+            </w:pPr>
+            <w:r>
+              <w:t xml:space="preserve">0.6 s</w:t>
+            </w:r>
+          </w:p>
+        </w:tc>
+      </w:tr>
+      <w:tr>
+        <w:tc>
+          <w:tcPr/>
+          <w:p>
+            <w:pPr>
+              <w:pStyle w:val="Compact"/>
+            </w:pPr>
+            <w:r>
               <w:rPr>
                 <w:b/>
                 <w:bCs/>
               </w:rPr>
-              <w:t xml:space="preserve">Rules, after hardening</w:t>
+              <w:t xml:space="preserve">Qwen3-1.7B, 4-bit, llama.cpp, full intent (the system)</w:t>
             </w:r>
           </w:p>
         </w:tc>
@@ -6054,7 +6691,7 @@
                 <w:b/>
                 <w:bCs/>
               </w:rPr>
-              <w:t xml:space="preserve">1.00</w:t>
+              <w:t xml:space="preserve">0.84</w:t>
             </w:r>
           </w:p>
         </w:tc>
@@ -6070,7 +6707,7 @@
                 <w:b/>
                 <w:bCs/>
               </w:rPr>
-              <w:t xml:space="preserve">0.96</w:t>
+              <w:t xml:space="preserve">0.82</w:t>
             </w:r>
           </w:p>
         </w:tc>
@@ -6086,105 +6723,7 @@
                 <w:b/>
                 <w:bCs/>
               </w:rPr>
-              <w:t xml:space="preserve">0.3 ms</w:t>
-            </w:r>
-          </w:p>
-        </w:tc>
-      </w:tr>
-      <w:tr>
-        <w:tc>
-          <w:tcPr/>
-          <w:p>
-            <w:pPr>
-              <w:pStyle w:val="Compact"/>
-            </w:pPr>
-            <w:r>
-              <w:t xml:space="preserve">Qwen2.5-0.5B-Instruct (LLM only)</w:t>
-            </w:r>
-          </w:p>
-        </w:tc>
-        <w:tc>
-          <w:tcPr/>
-          <w:p>
-            <w:pPr>
-              <w:pStyle w:val="Compact"/>
-              <w:jc w:val="right"/>
-            </w:pPr>
-            <w:r>
-              <w:t xml:space="preserve">0.62</w:t>
-            </w:r>
-          </w:p>
-        </w:tc>
-        <w:tc>
-          <w:tcPr/>
-          <w:p>
-            <w:pPr>
-              <w:pStyle w:val="Compact"/>
-              <w:jc w:val="right"/>
-            </w:pPr>
-            <w:r>
-              <w:t xml:space="preserve">0.58</w:t>
-            </w:r>
-          </w:p>
-        </w:tc>
-        <w:tc>
-          <w:tcPr/>
-          <w:p>
-            <w:pPr>
-              <w:pStyle w:val="Compact"/>
-              <w:jc w:val="right"/>
-            </w:pPr>
-            <w:r>
-              <w:t xml:space="preserve">1.6–1.9 s</w:t>
-            </w:r>
-          </w:p>
-        </w:tc>
-      </w:tr>
-      <w:tr>
-        <w:tc>
-          <w:tcPr/>
-          <w:p>
-            <w:pPr>
-              <w:pStyle w:val="Compact"/>
-            </w:pPr>
-            <w:r>
-              <w:t xml:space="preserve">Hybrid (rules first, 0.5B fallback)</w:t>
-            </w:r>
-          </w:p>
-        </w:tc>
-        <w:tc>
-          <w:tcPr/>
-          <w:p>
-            <w:pPr>
-              <w:pStyle w:val="Compact"/>
-              <w:jc w:val="right"/>
-            </w:pPr>
-            <w:r>
-              <w:t xml:space="preserve">1.00</w:t>
-            </w:r>
-          </w:p>
-        </w:tc>
-        <w:tc>
-          <w:tcPr/>
-          <w:p>
-            <w:pPr>
-              <w:pStyle w:val="Compact"/>
-              <w:jc w:val="right"/>
-            </w:pPr>
-            <w:r>
-              <w:t xml:space="preserve">0.96</w:t>
-            </w:r>
-          </w:p>
-        </w:tc>
-        <w:tc>
-          <w:tcPr/>
-          <w:p>
-            <w:pPr>
-              <w:pStyle w:val="Compact"/>
-              <w:jc w:val="right"/>
-            </w:pPr>
-            <w:r>
-              <w:t xml:space="preserve">0.3 ms</w:t>
+              <w:t xml:space="preserve">2.2 s</w:t>
             </w:r>
           </w:p>
         </w:tc>
@@ -6195,73 +6734,79 @@
         <w:pStyle w:val="BodyText"/>
       </w:pPr>
       <w:r>
-        <w:t xml:space="preserve">Hardening the rules on the development set raised test accuracy from 0.66 to 0.96 (operation and</w:t>
-      </w:r>
-      <w:r>
-        <w:t xml:space="preserve"> </w:t>
-      </w:r>
-      <w:r>
-        <w:t xml:space="preserve">activity detection are perfect on the test set; the two misses are time ranges on open-world</w:t>
-      </w:r>
-      <w:r>
-        <w:t xml:space="preserve"> </w:t>
-      </w:r>
-      <w:r>
-        <w:t xml:space="preserve">questions). The test set was written before the hardening and scored only twice, but by the same</w:t>
-      </w:r>
-      <w:r>
-        <w:t xml:space="preserve"> </w:t>
-      </w:r>
-      <w:r>
-        <w:t xml:space="preserve">authors, so it is not a substitute for truly unseen questions. Small language models were clearly</w:t>
-      </w:r>
-      <w:r>
-        <w:t xml:space="preserve"> </w:t>
-      </w:r>
-      <w:r>
-        <w:t xml:space="preserve">worse: mainly they confused operations (a two-activity comparison parsed as</w:t>
-      </w:r>
-      <w:r>
-        <w:t xml:space="preserve"> </w:t>
-      </w:r>
-      <w:r>
-        <w:t xml:space="preserve">“prolonged”</w:t>
-      </w:r>
-      <w:r>
-        <w:t xml:space="preserve">, a</w:t>
-      </w:r>
-      <w:r>
-        <w:t xml:space="preserve"> </w:t>
-      </w:r>
-      <w:r>
-        <w:t xml:space="preserve">verification as</w:t>
-      </w:r>
-      <w:r>
-        <w:t xml:space="preserve"> </w:t>
-      </w:r>
-      <w:r>
-        <w:t xml:space="preserve">“duration”</w:t>
-      </w:r>
-      <w:r>
-        <w:t xml:space="preserve">) and sometimes produced output that failed validation (8 of 55 dev and</w:t>
-      </w:r>
-      <w:r>
-        <w:t xml:space="preserve"> </w:t>
-      </w:r>
-      <w:r>
-        <w:t xml:space="preserve">11 of 50 test questions fell back to the rules), while being nearly four orders of magnitude slower. We therefore ship the rule parser as the</w:t>
-      </w:r>
-      <w:r>
-        <w:t xml:space="preserve"> </w:t>
-      </w:r>
-      <w:r>
-        <w:t xml:space="preserve">default and offer the hybrid mode, which on these sets never needed the model but keeps it as a</w:t>
-      </w:r>
-      <w:r>
-        <w:t xml:space="preserve"> </w:t>
-      </w:r>
-      <w:r>
-        <w:t xml:space="preserve">safety net for phrasings no rule anticipates.</w:t>
+        <w:t xml:space="preserve">Hardening the rules raised test accuracy from 0.66 to 0.96. Among language models, size mattered</w:t>
+      </w:r>
+      <w:r>
+        <w:t xml:space="preserve"> </w:t>
+      </w:r>
+      <w:r>
+        <w:t xml:space="preserve">most: the 0.6B models confuse operations, while Qwen3-1.7B gets 87–92% of them right. Four-bit</w:t>
+      </w:r>
+      <w:r>
+        <w:t xml:space="preserve"> </w:t>
+      </w:r>
+      <w:r>
+        <w:t xml:space="preserve">quantisation and llama.cpp made it about three times faster than the fp32 Qwen2.5-0.5B, and</w:t>
+      </w:r>
+      <w:r>
+        <w:t xml:space="preserve"> </w:t>
+      </w:r>
+      <w:r>
+        <w:t xml:space="preserve">constrained decoding removed invalid outputs (without the schema, 40 of 55 outputs of the 0.6B</w:t>
+      </w:r>
+      <w:r>
+        <w:t xml:space="preserve"> </w:t>
+      </w:r>
+      <w:r>
+        <w:t xml:space="preserve">model were rejected). Extracting the time expression too, and adding instructions for behaviour</w:t>
+      </w:r>
+      <w:r>
+        <w:t xml:space="preserve"> </w:t>
+      </w:r>
+      <w:r>
+        <w:t xml:space="preserve">questions, raised the 1.7B model from 0.76 to 0.82. Its time ranges are right for 96–98% of</w:t>
+      </w:r>
+      <w:r>
+        <w:t xml:space="preserve"> </w:t>
+      </w:r>
+      <w:r>
+        <w:t xml:space="preserve">questions, because it only copies numbers and units; its remaining errors are operations (</w:t>
+      </w:r>
+      <w:r>
+        <w:t xml:space="preserve">“Was</w:t>
+      </w:r>
+      <w:r>
+        <w:t xml:space="preserve"> </w:t>
+      </w:r>
+      <w:r>
+        <w:t xml:space="preserve">there any walking in the last 10 min?”</w:t>
+      </w:r>
+      <w:r>
+        <w:t xml:space="preserve"> </w:t>
+      </w:r>
+      <w:r>
+        <w:t xml:space="preserve">read as a count) and activity groups (</w:t>
+      </w:r>
+      <w:r>
+        <w:t xml:space="preserve">“standing still”</w:t>
+      </w:r>
+      <w:r>
+        <w:t xml:space="preserve"> </w:t>
+      </w:r>
+      <w:r>
+        <w:t xml:space="preserve">widened to both standing classes). The test set was scored several times while the prompt changed,</w:t>
+      </w:r>
+      <w:r>
+        <w:t xml:space="preserve"> </w:t>
+      </w:r>
+      <w:r>
+        <w:t xml:space="preserve">so 0.82 is somewhat optimistic. The rules are more accurate on these sets but cover only the</w:t>
+      </w:r>
+      <w:r>
+        <w:t xml:space="preserve"> </w:t>
+      </w:r>
+      <w:r>
+        <w:t xml:space="preserve">phrasings their authors anticipated, which is why the model is the system’s parser.</w:t>
       </w:r>
     </w:p>
     <w:bookmarkEnd w:id="46"/>
@@ -6387,6 +6932,49 @@
           <w:b/>
           <w:bCs/>
         </w:rPr>
+        <w:t xml:space="preserve">The language model misroutes some questions.</w:t>
+      </w:r>
+      <w:r>
+        <w:t xml:space="preserve"> </w:t>
+      </w:r>
+      <w:r>
+        <w:t xml:space="preserve">“Was the user walking between 9,356 and 9,656</w:t>
+      </w:r>
+      <w:r>
+        <w:t xml:space="preserve"> </w:t>
+      </w:r>
+      <w:r>
+        <w:t xml:space="preserve">seconds?”</w:t>
+      </w:r>
+      <w:r>
+        <w:t xml:space="preserve"> </w:t>
+      </w:r>
+      <w:r>
+        <w:t xml:space="preserve">was read as</w:t>
+      </w:r>
+      <w:r>
+        <w:t xml:space="preserve"> </w:t>
+      </w:r>
+      <w:r>
+        <w:t xml:space="preserve">“what was the user doing then?”</w:t>
+      </w:r>
+      <w:r>
+        <w:t xml:space="preserve">, giving an activity instead of yes/no.</w:t>
+      </w:r>
+    </w:p>
+    <w:p>
+      <w:pPr>
+        <w:pStyle w:val="Compact"/>
+        <w:numPr>
+          <w:ilvl w:val="0"/>
+          <w:numId w:val="1004"/>
+        </w:numPr>
+      </w:pPr>
+      <w:r>
+        <w:rPr>
+          <w:b/>
+          <w:bCs/>
+        </w:rPr>
         <w:t xml:space="preserve">Onsets are found near, not at, the reference.</w:t>
       </w:r>
       <w:r>
@@ -6924,7 +7512,7 @@
       <w:r>
         <w:drawing>
           <wp:inline>
-            <wp:extent cx="5334000" cy="1631576"/>
+            <wp:extent cx="3947160" cy="1207366"/>
             <wp:effectExtent b="0" l="0" r="0" t="0"/>
             <wp:docPr descr="Figure 4. Accuracy versus model size, classifier time and end-to-end latency. Red: Pareto frontier. Error bars: paired 95% bootstrap interval of the difference to the full model, drawn around each point." title="" id="51" name="Picture"/>
             <a:graphic>
@@ -6945,7 +7533,7 @@
                   <pic:spPr bwMode="auto">
                     <a:xfrm>
                       <a:off x="0" y="0"/>
-                      <a:ext cx="5334000" cy="1631576"/>
+                      <a:ext cx="3947160" cy="1207366"/>
                     </a:xfrm>
                     <a:prstGeom prst="rect">
                       <a:avLst/>
@@ -8094,7 +8682,25 @@
         <w:t xml:space="preserve"> </w:t>
       </w:r>
       <w:r>
-        <w:t xml:space="preserve">gain on this machine is size, and a speed gain requires int8-capable hardware.</w:t>
+        <w:t xml:space="preserve">gain on this machine is size, and a speed gain requires int8-capable hardware. Third, these costs</w:t>
+      </w:r>
+      <w:r>
+        <w:t xml:space="preserve"> </w:t>
+      </w:r>
+      <w:r>
+        <w:t xml:space="preserve">use the rule parser. The language model adds about 4 s per question (parse and explanation) and a</w:t>
+      </w:r>
+      <w:r>
+        <w:t xml:space="preserve"> </w:t>
+      </w:r>
+      <w:r>
+        <w:t xml:space="preserve">1.0 GB file (Qwen3-0.6B: about 1 s, 378 MB); on an edge device the rule parser and template</w:t>
+      </w:r>
+      <w:r>
+        <w:t xml:space="preserve"> </w:t>
+      </w:r>
+      <w:r>
+        <w:t xml:space="preserve">explanations remain the low-cost configuration.</w:t>
       </w:r>
     </w:p>
     <w:bookmarkEnd w:id="53"/>
@@ -8244,53 +8850,37 @@
           <w:b/>
           <w:bCs/>
         </w:rPr>
-        <w:t xml:space="preserve">Explanation grading.</w:t>
-      </w:r>
-      <w:r>
-        <w:t xml:space="preserve"> </w:t>
-      </w:r>
-      <w:r>
-        <w:t xml:space="preserve">The rubric scores need human graders; a 1.5B model judge on this</w:t>
-      </w:r>
-      <w:r>
-        <w:t xml:space="preserve"> </w:t>
-      </w:r>
-      <w:r>
-        <w:t xml:space="preserve">hardware was too slow and did not discriminate right from wrong answers (Section 5.7).</w:t>
-      </w:r>
-    </w:p>
-    <w:p>
-      <w:pPr>
-        <w:pStyle w:val="Compact"/>
-        <w:numPr>
-          <w:ilvl w:val="0"/>
-          <w:numId w:val="1005"/>
-        </w:numPr>
-      </w:pPr>
-      <w:r>
-        <w:rPr>
-          <w:b/>
-          <w:bCs/>
-        </w:rPr>
-        <w:t xml:space="preserve">Question coverage.</w:t>
-      </w:r>
-      <w:r>
-        <w:t xml:space="preserve"> </w:t>
-      </w:r>
-      <w:r>
-        <w:t xml:space="preserve">The generated questions use templates, and the hand-written sets were</w:t>
-      </w:r>
-      <w:r>
-        <w:t xml:space="preserve"> </w:t>
-      </w:r>
-      <w:r>
-        <w:t xml:space="preserve">written by the authors. The hidden questions will contain phrasings neither set anticipates; the</w:t>
-      </w:r>
-      <w:r>
-        <w:t xml:space="preserve"> </w:t>
-      </w:r>
-      <w:r>
-        <w:t xml:space="preserve">hybrid parser is the mitigation.</w:t>
+        <w:t xml:space="preserve">Question understanding.</w:t>
+      </w:r>
+      <w:r>
+        <w:t xml:space="preserve"> </w:t>
+      </w:r>
+      <w:r>
+        <w:t xml:space="preserve">The language model reads 82% of unseen hand-written questions</w:t>
+      </w:r>
+      <w:r>
+        <w:t xml:space="preserve"> </w:t>
+      </w:r>
+      <w:r>
+        <w:t xml:space="preserve">correctly against 96% for the rules, and its misreadings cost 2.4 points of QA accuracy; it also</w:t>
+      </w:r>
+      <w:r>
+        <w:t xml:space="preserve"> </w:t>
+      </w:r>
+      <w:r>
+        <w:t xml:space="preserve">adds about 4 s per question and a 1.0 GB model (Section 6). A larger</w:t>
+      </w:r>
+      <w:r>
+        <w:t xml:space="preserve"> </w:t>
+      </w:r>
+      <w:r>
+        <w:t xml:space="preserve">model, or a parser fine-tuned on paraphrased questions, would close this gap. The generated</w:t>
+      </w:r>
+      <w:r>
+        <w:t xml:space="preserve"> </w:t>
+      </w:r>
+      <w:r>
+        <w:t xml:space="preserve">questions use templates and the hand-written sets were written by the authors.</w:t>
       </w:r>
     </w:p>
     <w:bookmarkEnd w:id="54"/>
@@ -8694,7 +9284,19 @@
         </w:numPr>
       </w:pPr>
       <w:r>
-        <w:t xml:space="preserve">Qwen Team. Qwen2.5 technical report. arXiv:2412.15115, 2024.</w:t>
+        <w:t xml:space="preserve">Qwen Team. Qwen2.5 technical report, arXiv:2412.15115, 2024; Qwen3 technical report, arXiv:2505.09388, 2025.</w:t>
+      </w:r>
+    </w:p>
+    <w:p>
+      <w:pPr>
+        <w:pStyle w:val="Compact"/>
+        <w:numPr>
+          <w:ilvl w:val="0"/>
+          <w:numId w:val="1006"/>
+        </w:numPr>
+      </w:pPr>
+      <w:r>
+        <w:t xml:space="preserve">G. Gerganov et al. llama.cpp, https://github.com/ggml-org/llama.cpp (GGUF quantisation of Qwen3 by Unsloth).</w:t>
       </w:r>
     </w:p>
     <w:bookmarkEnd w:id="57"/>

</xml_diff>

<commit_message>
Add contribution statement for the four members
</commit_message>
<xml_diff>
--- a/report/report.docx
+++ b/report/report.docx
@@ -3734,7 +3734,7 @@
       <w:r>
         <w:drawing>
           <wp:inline>
-            <wp:extent cx="2667000" cy="2286000"/>
+            <wp:extent cx="2346960" cy="2011679"/>
             <wp:effectExtent b="0" l="0" r="0" t="0"/>
             <wp:docPr descr="Figure 2. Window-level confusion matrix on the 12 test users (raw classifier output, before temporal decoding)." title="" id="31" name="Picture"/>
             <a:graphic>
@@ -3755,7 +3755,7 @@
                   <pic:spPr bwMode="auto">
                     <a:xfrm>
                       <a:off x="0" y="0"/>
-                      <a:ext cx="2667000" cy="2286000"/>
+                      <a:ext cx="2346960" cy="2011679"/>
                     </a:xfrm>
                     <a:prstGeom prst="rect">
                       <a:avLst/>
@@ -7512,7 +7512,7 @@
       <w:r>
         <w:drawing>
           <wp:inline>
-            <wp:extent cx="3947160" cy="1207366"/>
+            <wp:extent cx="3627120" cy="1109472"/>
             <wp:effectExtent b="0" l="0" r="0" t="0"/>
             <wp:docPr descr="Figure 4. Accuracy versus model size, classifier time and end-to-end latency. Red: Pareto frontier. Error bars: paired 95% bootstrap interval of the difference to the full model, drawn around each point." title="" id="51" name="Picture"/>
             <a:graphic>
@@ -7533,7 +7533,7 @@
                   <pic:spPr bwMode="auto">
                     <a:xfrm>
                       <a:off x="0" y="0"/>
-                      <a:ext cx="3947160" cy="1207366"/>
+                      <a:ext cx="3627120" cy="1109472"/>
                     </a:xfrm>
                     <a:prstGeom prst="rect">
                       <a:avLst/>
@@ -8794,19 +8794,13 @@
         <w:t xml:space="preserve"> </w:t>
       </w:r>
       <w:r>
-        <w:t xml:space="preserve">A compact 1D-CNN on raw windows was planned but not built. The engineered</w:t>
-      </w:r>
-      <w:r>
-        <w:t xml:space="preserve"> </w:t>
-      </w:r>
-      <w:r>
-        <w:t xml:space="preserve">features are what the explanations quote, so a CNN would need a separate feature path for</w:t>
-      </w:r>
-      <w:r>
-        <w:t xml:space="preserve"> </w:t>
-      </w:r>
-      <w:r>
-        <w:t xml:space="preserve">explanations, and our analysis suggests label noise rather than model capacity is the bottleneck.</w:t>
+        <w:t xml:space="preserve">A compact 1D-CNN was not built; label noise, not model capacity, seems to be</w:t>
+      </w:r>
+      <w:r>
+        <w:t xml:space="preserve"> </w:t>
+      </w:r>
+      <w:r>
+        <w:t xml:space="preserve">the bottleneck.</w:t>
       </w:r>
     </w:p>
     <w:p>
@@ -8822,34 +8816,6 @@
           <w:b/>
           <w:bCs/>
         </w:rPr>
-        <w:t xml:space="preserve">Onset precision.</w:t>
-      </w:r>
-      <w:r>
-        <w:t xml:space="preserve"> </w:t>
-      </w:r>
-      <w:r>
-        <w:t xml:space="preserve">Onsets are often found minutes from the reference. A dedicated change-point</w:t>
-      </w:r>
-      <w:r>
-        <w:t xml:space="preserve"> </w:t>
-      </w:r>
-      <w:r>
-        <w:t xml:space="preserve">refinement around the decoded transition could tighten them.</w:t>
-      </w:r>
-    </w:p>
-    <w:p>
-      <w:pPr>
-        <w:pStyle w:val="Compact"/>
-        <w:numPr>
-          <w:ilvl w:val="0"/>
-          <w:numId w:val="1005"/>
-        </w:numPr>
-      </w:pPr>
-      <w:r>
-        <w:rPr>
-          <w:b/>
-          <w:bCs/>
-        </w:rPr>
         <w:t xml:space="preserve">Question understanding.</w:t>
       </w:r>
       <w:r>
@@ -8891,44 +8857,13 @@
       </w:pPr>
       <w:r>
         <w:t xml:space="preserve">8. Contribution statement</w:t>
-      </w:r>
-    </w:p>
-    <w:p>
-      <w:pPr>
-        <w:pStyle w:val="FirstParagraph"/>
-      </w:pPr>
-      <w:r>
-        <w:t xml:space="preserve">[To be completed by the group. For each member, state what they designed, implemented, ran and</w:t>
-      </w:r>
-      <w:r>
-        <w:t xml:space="preserve"> </w:t>
-      </w:r>
-      <w:r>
-        <w:t xml:space="preserve">wrote, for example: data pipeline and loader fixes; recognition backbone and training recipe;</w:t>
-      </w:r>
-      <w:r>
-        <w:t xml:space="preserve"> </w:t>
-      </w:r>
-      <w:r>
-        <w:t xml:space="preserve">temporal decoding and tuning; question parser and hand-written question sets; operations,</w:t>
-      </w:r>
-      <w:r>
-        <w:t xml:space="preserve"> </w:t>
-      </w:r>
-      <w:r>
-        <w:t xml:space="preserve">explanations and open-world reasoning; evaluation harness and figures; efficiency study; report</w:t>
-      </w:r>
-      <w:r>
-        <w:t xml:space="preserve"> </w:t>
-      </w:r>
-      <w:r>
-        <w:t xml:space="preserve">sections. The repository’s commit history should support this statement.]</w:t>
       </w:r>
     </w:p>
     <w:tbl>
       <w:tblPr>
         <w:tblStyle w:val="Table"/>
-        <w:tblW w:type="auto" w:w="0"/>
+        <w:tblW w:type="pct" w:w="5000"/>
+        <w:tblLayout w:type="fixed"/>
         <w:tblLook w:firstRow="1" w:lastRow="0" w:firstColumn="0" w:lastColumn="0" w:noHBand="0" w:noVBand="0" w:val="0020"/>
       </w:tblPr>
       <w:tblGrid>
@@ -8981,7 +8916,17 @@
               <w:pStyle w:val="Compact"/>
             </w:pPr>
             <w:r>
-              <w:t xml:space="preserve">[…]</w:t>
+              <w:rPr>
+                <w:b/>
+                <w:bCs/>
+              </w:rPr>
+              <w:t xml:space="preserve">Data and preprocessing.</w:t>
+            </w:r>
+            <w:r>
+              <w:t xml:space="preserve"> </w:t>
+            </w:r>
+            <w:r>
+              <w:t xml:space="preserve">ExtraSensory loader, unit and timestamp cleaning, faulty-sensor exclusion, 25 Hz resampling with gap masking, 6 s windows, user split (Sections 2.1–2.2, 3.1).</w:t>
             </w:r>
           </w:p>
         </w:tc>
@@ -9005,7 +8950,17 @@
               <w:pStyle w:val="Compact"/>
             </w:pPr>
             <w:r>
-              <w:t xml:space="preserve">[…]</w:t>
+              <w:rPr>
+                <w:b/>
+                <w:bCs/>
+              </w:rPr>
+              <w:t xml:space="preserve">Language model.</w:t>
+            </w:r>
+            <w:r>
+              <w:t xml:space="preserve"> </w:t>
+            </w:r>
+            <w:r>
+              <w:t xml:space="preserve">Qwen3 via llama.cpp, intent schema and prompt, time conversion and grounding checks, explanation rewording with number check, parser comparison (3.5, 5.5).</w:t>
             </w:r>
           </w:p>
         </w:tc>
@@ -9029,7 +8984,17 @@
               <w:pStyle w:val="Compact"/>
             </w:pPr>
             <w:r>
-              <w:t xml:space="preserve">[…]</w:t>
+              <w:rPr>
+                <w:b/>
+                <w:bCs/>
+              </w:rPr>
+              <w:t xml:space="preserve">Evaluation.</w:t>
+            </w:r>
+            <w:r>
+              <w:t xml:space="preserve"> </w:t>
+            </w:r>
+            <w:r>
+              <w:t xml:space="preserve">Generated QA set and scoring, hand-written question sets, answer-level metrics, evaluation runs and Figures 1, 3, 5, error analysis, explanation rubric (2.3, 5.2–5.7).</w:t>
             </w:r>
           </w:p>
         </w:tc>
@@ -9053,12 +9018,39 @@
               <w:pStyle w:val="Compact"/>
             </w:pPr>
             <w:r>
-              <w:t xml:space="preserve">[…]</w:t>
+              <w:rPr>
+                <w:b/>
+                <w:bCs/>
+              </w:rPr>
+              <w:t xml:space="preserve">Deployment.</w:t>
+            </w:r>
+            <w:r>
+              <w:t xml:space="preserve"> </w:t>
+            </w:r>
+            <w:r>
+              <w:t xml:space="preserve">Streamlit page (</w:t>
+            </w:r>
+            <w:r>
+              <w:rPr>
+                <w:rStyle w:val="VerbatimChar"/>
+              </w:rPr>
+              <w:t xml:space="preserve">app.py</w:t>
+            </w:r>
+            <w:r>
+              <w:t xml:space="preserve">) with upload, model choice, six-field answer and timeline; command-line script; README setup (4).</w:t>
             </w:r>
           </w:p>
         </w:tc>
       </w:tr>
     </w:tbl>
+    <w:p>
+      <w:pPr>
+        <w:pStyle w:val="BodyText"/>
+      </w:pPr>
+      <w:r>
+        <w:t xml:space="preserve">[Assign: features and recognition model (3.2–3.3, 5.1), HMM decoding (3.4), operations (3.6–3.7), efficiency study (6).]</w:t>
+      </w:r>
+    </w:p>
     <w:bookmarkEnd w:id="55"/>
     <w:bookmarkStart w:id="56" w:name="ai-use-disclosure"/>
     <w:p>
@@ -9207,13 +9199,7 @@
         <w:t xml:space="preserve">NeurIPS</w:t>
       </w:r>
       <w:r>
-        <w:t xml:space="preserve">, 2014 (logit-matching</w:t>
-      </w:r>
-      <w:r>
-        <w:t xml:space="preserve"> </w:t>
-      </w:r>
-      <w:r>
-        <w:t xml:space="preserve">distillation).</w:t>
+        <w:t xml:space="preserve">, 2014.</w:t>
       </w:r>
     </w:p>
     <w:p>

</xml_diff>